<commit_message>
S10: Entrega grupal Empresa 01 (Colque, Perez, Arocutipa) - Actualización de informe final e índice
</commit_message>
<xml_diff>
--- a/SI886-S10-TALLER-Empresa1_Colque_Perez_Arocutipa.docx
+++ b/SI886-S10-TALLER-Empresa1_Colque_Perez_Arocutipa.docx
@@ -74,7 +74,7 @@
           <w:noProof/>
         </w:rPr>
         <w:drawing>
-          <wp:inline distT="0" distB="0" distL="0" distR="0" wp14:anchorId="36182FF9" wp14:editId="58F542C4">
+          <wp:inline distT="0" distB="0" distL="0" distR="0" wp14:anchorId="702762EA" wp14:editId="320A9721">
             <wp:extent cx="1295999" cy="1353524"/>
             <wp:effectExtent l="0" t="0" r="0" b="0"/>
             <wp:docPr id="1391959141" name="Picture"/>
@@ -439,7 +439,7 @@
       <w:pPr>
         <w:pStyle w:val="Ttulo1"/>
       </w:pPr>
-      <w:bookmarkStart w:id="1" w:name="_Toc242980109"/>
+      <w:bookmarkStart w:id="1" w:name="_Toc242980529"/>
       <w:r>
         <w:lastRenderedPageBreak/>
         <w:t>Índice</w:t>
@@ -455,7 +455,7 @@
         <w:rPr>
           <w:rFonts w:asciiTheme="minorHAnsi" w:eastAsiaTheme="minorEastAsia" w:hAnsiTheme="minorHAnsi" w:cstheme="minorBidi"/>
           <w:noProof/>
-          <w:lang w:val="es-PE" w:eastAsia="es-PE"/>
+          <w:lang w:eastAsia="es-PE"/>
         </w:rPr>
       </w:pPr>
       <w:r>
@@ -467,7 +467,7 @@
       <w:r>
         <w:fldChar w:fldCharType="separate"/>
       </w:r>
-      <w:hyperlink w:anchor="_Toc242980109" w:history="1">
+      <w:hyperlink w:anchor="_Toc242980529" w:history="1">
         <w:r>
           <w:rPr>
             <w:rStyle w:val="Hipervnculo"/>
@@ -494,7 +494,7 @@
             <w:noProof/>
             <w:webHidden/>
           </w:rPr>
-          <w:instrText xml:space="preserve"> PAGEREF _Toc242980109 \h </w:instrText>
+          <w:instrText xml:space="preserve"> PAGEREF _Toc242980529 \h </w:instrText>
         </w:r>
         <w:r>
           <w:rPr>
@@ -534,16 +534,16 @@
         <w:rPr>
           <w:rFonts w:asciiTheme="minorHAnsi" w:eastAsiaTheme="minorEastAsia" w:hAnsiTheme="minorHAnsi" w:cstheme="minorBidi"/>
           <w:noProof/>
-          <w:lang w:val="es-PE" w:eastAsia="es-PE"/>
-        </w:rPr>
-      </w:pPr>
-      <w:hyperlink w:anchor="_Toc242980110" w:history="1">
+          <w:lang w:eastAsia="es-PE"/>
+        </w:rPr>
+      </w:pPr>
+      <w:hyperlink w:anchor="_Toc242980530" w:history="1">
         <w:r>
           <w:rPr>
             <w:rStyle w:val="Hipervnculo"/>
             <w:noProof/>
           </w:rPr>
-          <w:t>Cómo se usa esta plantilla</w:t>
+          <w:t>1. Información sobre el evento práctico</w:t>
         </w:r>
         <w:r>
           <w:rPr>
@@ -564,7 +564,7 @@
             <w:noProof/>
             <w:webHidden/>
           </w:rPr>
-          <w:instrText xml:space="preserve"> PAGEREF _Toc242980110 \h </w:instrText>
+          <w:instrText xml:space="preserve"> PAGEREF _Toc242980530 \h </w:instrText>
         </w:r>
         <w:r>
           <w:rPr>
@@ -585,6 +585,426 @@
             <w:webHidden/>
           </w:rPr>
           <w:t>3</w:t>
+        </w:r>
+        <w:r>
+          <w:rPr>
+            <w:noProof/>
+            <w:webHidden/>
+          </w:rPr>
+          <w:fldChar w:fldCharType="end"/>
+        </w:r>
+      </w:hyperlink>
+    </w:p>
+    <w:p>
+      <w:pPr>
+        <w:pStyle w:val="TDC2"/>
+        <w:tabs>
+          <w:tab w:val="right" w:leader="dot" w:pos="9344"/>
+        </w:tabs>
+        <w:rPr>
+          <w:rFonts w:asciiTheme="minorHAnsi" w:eastAsiaTheme="minorEastAsia" w:hAnsiTheme="minorHAnsi" w:cstheme="minorBidi"/>
+          <w:noProof/>
+          <w:lang w:eastAsia="es-PE"/>
+        </w:rPr>
+      </w:pPr>
+      <w:hyperlink w:anchor="_Toc242980531" w:history="1">
+        <w:r>
+          <w:rPr>
+            <w:rStyle w:val="Hipervnculo"/>
+            <w:noProof/>
+          </w:rPr>
+          <w:t>1.1 Título del evento práctico</w:t>
+        </w:r>
+        <w:r>
+          <w:rPr>
+            <w:noProof/>
+            <w:webHidden/>
+          </w:rPr>
+          <w:tab/>
+        </w:r>
+        <w:r>
+          <w:rPr>
+            <w:noProof/>
+            <w:webHidden/>
+          </w:rPr>
+          <w:fldChar w:fldCharType="begin"/>
+        </w:r>
+        <w:r>
+          <w:rPr>
+            <w:noProof/>
+            <w:webHidden/>
+          </w:rPr>
+          <w:instrText xml:space="preserve"> PAGEREF _Toc242980531 \h </w:instrText>
+        </w:r>
+        <w:r>
+          <w:rPr>
+            <w:noProof/>
+            <w:webHidden/>
+          </w:rPr>
+        </w:r>
+        <w:r>
+          <w:rPr>
+            <w:noProof/>
+            <w:webHidden/>
+          </w:rPr>
+          <w:fldChar w:fldCharType="separate"/>
+        </w:r>
+        <w:r>
+          <w:rPr>
+            <w:noProof/>
+            <w:webHidden/>
+          </w:rPr>
+          <w:t>3</w:t>
+        </w:r>
+        <w:r>
+          <w:rPr>
+            <w:noProof/>
+            <w:webHidden/>
+          </w:rPr>
+          <w:fldChar w:fldCharType="end"/>
+        </w:r>
+      </w:hyperlink>
+    </w:p>
+    <w:p>
+      <w:pPr>
+        <w:pStyle w:val="TDC2"/>
+        <w:tabs>
+          <w:tab w:val="right" w:leader="dot" w:pos="9344"/>
+        </w:tabs>
+        <w:rPr>
+          <w:rFonts w:asciiTheme="minorHAnsi" w:eastAsiaTheme="minorEastAsia" w:hAnsiTheme="minorHAnsi" w:cstheme="minorBidi"/>
+          <w:noProof/>
+          <w:lang w:eastAsia="es-PE"/>
+        </w:rPr>
+      </w:pPr>
+      <w:hyperlink w:anchor="_Toc242980532" w:history="1">
+        <w:r>
+          <w:rPr>
+            <w:rStyle w:val="Hipervnculo"/>
+            <w:noProof/>
+          </w:rPr>
+          <w:t>1.2 Objetivos</w:t>
+        </w:r>
+        <w:r>
+          <w:rPr>
+            <w:noProof/>
+            <w:webHidden/>
+          </w:rPr>
+          <w:tab/>
+        </w:r>
+        <w:r>
+          <w:rPr>
+            <w:noProof/>
+            <w:webHidden/>
+          </w:rPr>
+          <w:fldChar w:fldCharType="begin"/>
+        </w:r>
+        <w:r>
+          <w:rPr>
+            <w:noProof/>
+            <w:webHidden/>
+          </w:rPr>
+          <w:instrText xml:space="preserve"> PAGEREF _Toc242980532 \h </w:instrText>
+        </w:r>
+        <w:r>
+          <w:rPr>
+            <w:noProof/>
+            <w:webHidden/>
+          </w:rPr>
+        </w:r>
+        <w:r>
+          <w:rPr>
+            <w:noProof/>
+            <w:webHidden/>
+          </w:rPr>
+          <w:fldChar w:fldCharType="separate"/>
+        </w:r>
+        <w:r>
+          <w:rPr>
+            <w:noProof/>
+            <w:webHidden/>
+          </w:rPr>
+          <w:t>3</w:t>
+        </w:r>
+        <w:r>
+          <w:rPr>
+            <w:noProof/>
+            <w:webHidden/>
+          </w:rPr>
+          <w:fldChar w:fldCharType="end"/>
+        </w:r>
+      </w:hyperlink>
+    </w:p>
+    <w:p>
+      <w:pPr>
+        <w:pStyle w:val="TDC2"/>
+        <w:tabs>
+          <w:tab w:val="right" w:leader="dot" w:pos="9344"/>
+        </w:tabs>
+        <w:rPr>
+          <w:rFonts w:asciiTheme="minorHAnsi" w:eastAsiaTheme="minorEastAsia" w:hAnsiTheme="minorHAnsi" w:cstheme="minorBidi"/>
+          <w:noProof/>
+          <w:lang w:eastAsia="es-PE"/>
+        </w:rPr>
+      </w:pPr>
+      <w:hyperlink w:anchor="_Toc242980533" w:history="1">
+        <w:r>
+          <w:rPr>
+            <w:rStyle w:val="Hipervnculo"/>
+            <w:noProof/>
+          </w:rPr>
+          <w:t>1.3 Tiempo de duración</w:t>
+        </w:r>
+        <w:r>
+          <w:rPr>
+            <w:noProof/>
+            <w:webHidden/>
+          </w:rPr>
+          <w:tab/>
+        </w:r>
+        <w:r>
+          <w:rPr>
+            <w:noProof/>
+            <w:webHidden/>
+          </w:rPr>
+          <w:fldChar w:fldCharType="begin"/>
+        </w:r>
+        <w:r>
+          <w:rPr>
+            <w:noProof/>
+            <w:webHidden/>
+          </w:rPr>
+          <w:instrText xml:space="preserve"> PAGEREF _Toc242980533 \h </w:instrText>
+        </w:r>
+        <w:r>
+          <w:rPr>
+            <w:noProof/>
+            <w:webHidden/>
+          </w:rPr>
+        </w:r>
+        <w:r>
+          <w:rPr>
+            <w:noProof/>
+            <w:webHidden/>
+          </w:rPr>
+          <w:fldChar w:fldCharType="separate"/>
+        </w:r>
+        <w:r>
+          <w:rPr>
+            <w:noProof/>
+            <w:webHidden/>
+          </w:rPr>
+          <w:t>3</w:t>
+        </w:r>
+        <w:r>
+          <w:rPr>
+            <w:noProof/>
+            <w:webHidden/>
+          </w:rPr>
+          <w:fldChar w:fldCharType="end"/>
+        </w:r>
+      </w:hyperlink>
+    </w:p>
+    <w:p>
+      <w:pPr>
+        <w:pStyle w:val="TDC2"/>
+        <w:tabs>
+          <w:tab w:val="right" w:leader="dot" w:pos="9344"/>
+        </w:tabs>
+        <w:rPr>
+          <w:rFonts w:asciiTheme="minorHAnsi" w:eastAsiaTheme="minorEastAsia" w:hAnsiTheme="minorHAnsi" w:cstheme="minorBidi"/>
+          <w:noProof/>
+          <w:lang w:eastAsia="es-PE"/>
+        </w:rPr>
+      </w:pPr>
+      <w:hyperlink w:anchor="_Toc242980534" w:history="1">
+        <w:r>
+          <w:rPr>
+            <w:rStyle w:val="Hipervnculo"/>
+            <w:noProof/>
+          </w:rPr>
+          <w:t>1.4 Resultados de aprendizaje</w:t>
+        </w:r>
+        <w:r>
+          <w:rPr>
+            <w:noProof/>
+            <w:webHidden/>
+          </w:rPr>
+          <w:tab/>
+        </w:r>
+        <w:r>
+          <w:rPr>
+            <w:noProof/>
+            <w:webHidden/>
+          </w:rPr>
+          <w:fldChar w:fldCharType="begin"/>
+        </w:r>
+        <w:r>
+          <w:rPr>
+            <w:noProof/>
+            <w:webHidden/>
+          </w:rPr>
+          <w:instrText xml:space="preserve"> PAGEREF _Toc242980534 \h </w:instrText>
+        </w:r>
+        <w:r>
+          <w:rPr>
+            <w:noProof/>
+            <w:webHidden/>
+          </w:rPr>
+        </w:r>
+        <w:r>
+          <w:rPr>
+            <w:noProof/>
+            <w:webHidden/>
+          </w:rPr>
+          <w:fldChar w:fldCharType="separate"/>
+        </w:r>
+        <w:r>
+          <w:rPr>
+            <w:noProof/>
+            <w:webHidden/>
+          </w:rPr>
+          <w:t>3</w:t>
+        </w:r>
+        <w:r>
+          <w:rPr>
+            <w:noProof/>
+            <w:webHidden/>
+          </w:rPr>
+          <w:fldChar w:fldCharType="end"/>
+        </w:r>
+      </w:hyperlink>
+    </w:p>
+    <w:p>
+      <w:pPr>
+        <w:pStyle w:val="TDC2"/>
+        <w:tabs>
+          <w:tab w:val="right" w:leader="dot" w:pos="9344"/>
+        </w:tabs>
+        <w:rPr>
+          <w:rFonts w:asciiTheme="minorHAnsi" w:eastAsiaTheme="minorEastAsia" w:hAnsiTheme="minorHAnsi" w:cstheme="minorBidi"/>
+          <w:noProof/>
+          <w:lang w:eastAsia="es-PE"/>
+        </w:rPr>
+      </w:pPr>
+      <w:hyperlink w:anchor="_Toc242980535" w:history="1">
+        <w:r>
+          <w:rPr>
+            <w:rStyle w:val="Hipervnculo"/>
+            <w:noProof/>
+          </w:rPr>
+          <w:t>1.5 Recursos</w:t>
+        </w:r>
+        <w:r>
+          <w:rPr>
+            <w:noProof/>
+            <w:webHidden/>
+          </w:rPr>
+          <w:tab/>
+        </w:r>
+        <w:r>
+          <w:rPr>
+            <w:noProof/>
+            <w:webHidden/>
+          </w:rPr>
+          <w:fldChar w:fldCharType="begin"/>
+        </w:r>
+        <w:r>
+          <w:rPr>
+            <w:noProof/>
+            <w:webHidden/>
+          </w:rPr>
+          <w:instrText xml:space="preserve"> PAGEREF _Toc242980535 \h </w:instrText>
+        </w:r>
+        <w:r>
+          <w:rPr>
+            <w:noProof/>
+            <w:webHidden/>
+          </w:rPr>
+        </w:r>
+        <w:r>
+          <w:rPr>
+            <w:noProof/>
+            <w:webHidden/>
+          </w:rPr>
+          <w:fldChar w:fldCharType="separate"/>
+        </w:r>
+        <w:r>
+          <w:rPr>
+            <w:noProof/>
+            <w:webHidden/>
+          </w:rPr>
+          <w:t>3</w:t>
+        </w:r>
+        <w:r>
+          <w:rPr>
+            <w:noProof/>
+            <w:webHidden/>
+          </w:rPr>
+          <w:fldChar w:fldCharType="end"/>
+        </w:r>
+      </w:hyperlink>
+    </w:p>
+    <w:p>
+      <w:pPr>
+        <w:pStyle w:val="TDC2"/>
+        <w:tabs>
+          <w:tab w:val="right" w:leader="dot" w:pos="9344"/>
+        </w:tabs>
+        <w:rPr>
+          <w:rFonts w:asciiTheme="minorHAnsi" w:eastAsiaTheme="minorEastAsia" w:hAnsiTheme="minorHAnsi" w:cstheme="minorBidi"/>
+          <w:noProof/>
+          <w:lang w:eastAsia="es-PE"/>
+        </w:rPr>
+      </w:pPr>
+      <w:hyperlink w:anchor="_Toc242980536" w:history="1">
+        <w:r>
+          <w:rPr>
+            <w:rStyle w:val="Hipervnculo"/>
+            <w:noProof/>
+          </w:rPr>
+          <w:t>1.6 Seguridad</w:t>
+        </w:r>
+        <w:r>
+          <w:rPr>
+            <w:noProof/>
+            <w:webHidden/>
+          </w:rPr>
+          <w:tab/>
+        </w:r>
+        <w:r>
+          <w:rPr>
+            <w:noProof/>
+            <w:webHidden/>
+          </w:rPr>
+          <w:fldChar w:fldCharType="begin"/>
+        </w:r>
+        <w:r>
+          <w:rPr>
+            <w:noProof/>
+            <w:webHidden/>
+          </w:rPr>
+          <w:instrText xml:space="preserve"> PAGEREF _Toc242980536 \h </w:instrText>
+        </w:r>
+        <w:r>
+          <w:rPr>
+            <w:noProof/>
+            <w:webHidden/>
+          </w:rPr>
+        </w:r>
+        <w:r>
+          <w:rPr>
+            <w:noProof/>
+            <w:webHidden/>
+          </w:rPr>
+          <w:fldChar w:fldCharType="separate"/>
+        </w:r>
+        <w:r>
+          <w:rPr>
+            <w:noProof/>
+            <w:webHidden/>
+          </w:rPr>
+          <w:t>4</w:t>
         </w:r>
         <w:r>
           <w:rPr>
@@ -604,16 +1024,16 @@
         <w:rPr>
           <w:rFonts w:asciiTheme="minorHAnsi" w:eastAsiaTheme="minorEastAsia" w:hAnsiTheme="minorHAnsi" w:cstheme="minorBidi"/>
           <w:noProof/>
-          <w:lang w:val="es-PE" w:eastAsia="es-PE"/>
-        </w:rPr>
-      </w:pPr>
-      <w:hyperlink w:anchor="_Toc242980111" w:history="1">
+          <w:lang w:eastAsia="es-PE"/>
+        </w:rPr>
+      </w:pPr>
+      <w:hyperlink w:anchor="_Toc242980537" w:history="1">
         <w:r>
           <w:rPr>
             <w:rStyle w:val="Hipervnculo"/>
             <w:noProof/>
           </w:rPr>
-          <w:t>1. Información sobre el evento práctico</w:t>
+          <w:t>2. Procedimiento o metodología</w:t>
         </w:r>
         <w:r>
           <w:rPr>
@@ -634,7 +1054,7 @@
             <w:noProof/>
             <w:webHidden/>
           </w:rPr>
-          <w:instrText xml:space="preserve"> PAGEREF _Toc242980111 \h </w:instrText>
+          <w:instrText xml:space="preserve"> PAGEREF _Toc242980537 \h </w:instrText>
         </w:r>
         <w:r>
           <w:rPr>
@@ -674,16 +1094,16 @@
         <w:rPr>
           <w:rFonts w:asciiTheme="minorHAnsi" w:eastAsiaTheme="minorEastAsia" w:hAnsiTheme="minorHAnsi" w:cstheme="minorBidi"/>
           <w:noProof/>
-          <w:lang w:val="es-PE" w:eastAsia="es-PE"/>
-        </w:rPr>
-      </w:pPr>
-      <w:hyperlink w:anchor="_Toc242980112" w:history="1">
+          <w:lang w:eastAsia="es-PE"/>
+        </w:rPr>
+      </w:pPr>
+      <w:hyperlink w:anchor="_Toc242980538" w:history="1">
         <w:r>
           <w:rPr>
             <w:rStyle w:val="Hipervnculo"/>
             <w:noProof/>
           </w:rPr>
-          <w:t>1.1 Título del evento práctico</w:t>
+          <w:t>Paso A — Declarar los principios de arquitectura</w:t>
         </w:r>
         <w:r>
           <w:rPr>
@@ -704,7 +1124,7 @@
             <w:noProof/>
             <w:webHidden/>
           </w:rPr>
-          <w:instrText xml:space="preserve"> PAGEREF _Toc242980112 \h </w:instrText>
+          <w:instrText xml:space="preserve"> PAGEREF _Toc242980538 \h </w:instrText>
         </w:r>
         <w:r>
           <w:rPr>
@@ -744,16 +1164,16 @@
         <w:rPr>
           <w:rFonts w:asciiTheme="minorHAnsi" w:eastAsiaTheme="minorEastAsia" w:hAnsiTheme="minorHAnsi" w:cstheme="minorBidi"/>
           <w:noProof/>
-          <w:lang w:val="es-PE" w:eastAsia="es-PE"/>
-        </w:rPr>
-      </w:pPr>
-      <w:hyperlink w:anchor="_Toc242980113" w:history="1">
+          <w:lang w:eastAsia="es-PE"/>
+        </w:rPr>
+      </w:pPr>
+      <w:hyperlink w:anchor="_Toc242980539" w:history="1">
         <w:r>
           <w:rPr>
             <w:rStyle w:val="Hipervnculo"/>
             <w:noProof/>
           </w:rPr>
-          <w:t>1.2 Objetivos</w:t>
+          <w:t>Paso B — Modelar la arquitectura actual (As-Is)</w:t>
         </w:r>
         <w:r>
           <w:rPr>
@@ -774,7 +1194,7 @@
             <w:noProof/>
             <w:webHidden/>
           </w:rPr>
-          <w:instrText xml:space="preserve"> PAGEREF _Toc242980113 \h </w:instrText>
+          <w:instrText xml:space="preserve"> PAGEREF _Toc242980539 \h </w:instrText>
         </w:r>
         <w:r>
           <w:rPr>
@@ -794,7 +1214,7 @@
             <w:noProof/>
             <w:webHidden/>
           </w:rPr>
-          <w:t>4</w:t>
+          <w:t>5</w:t>
         </w:r>
         <w:r>
           <w:rPr>
@@ -814,16 +1234,16 @@
         <w:rPr>
           <w:rFonts w:asciiTheme="minorHAnsi" w:eastAsiaTheme="minorEastAsia" w:hAnsiTheme="minorHAnsi" w:cstheme="minorBidi"/>
           <w:noProof/>
-          <w:lang w:val="es-PE" w:eastAsia="es-PE"/>
-        </w:rPr>
-      </w:pPr>
-      <w:hyperlink w:anchor="_Toc242980114" w:history="1">
+          <w:lang w:eastAsia="es-PE"/>
+        </w:rPr>
+      </w:pPr>
+      <w:hyperlink w:anchor="_Toc242980540" w:history="1">
         <w:r>
           <w:rPr>
             <w:rStyle w:val="Hipervnculo"/>
             <w:noProof/>
           </w:rPr>
-          <w:t>1.3 Tiempo de duración</w:t>
+          <w:t>Paso C — Modelar la arquitectura objetivo (To-Be)</w:t>
         </w:r>
         <w:r>
           <w:rPr>
@@ -844,7 +1264,7 @@
             <w:noProof/>
             <w:webHidden/>
           </w:rPr>
-          <w:instrText xml:space="preserve"> PAGEREF _Toc242980114 \h </w:instrText>
+          <w:instrText xml:space="preserve"> PAGEREF _Toc242980540 \h </w:instrText>
         </w:r>
         <w:r>
           <w:rPr>
@@ -864,7 +1284,7 @@
             <w:noProof/>
             <w:webHidden/>
           </w:rPr>
-          <w:t>4</w:t>
+          <w:t>7</w:t>
         </w:r>
         <w:r>
           <w:rPr>
@@ -884,16 +1304,16 @@
         <w:rPr>
           <w:rFonts w:asciiTheme="minorHAnsi" w:eastAsiaTheme="minorEastAsia" w:hAnsiTheme="minorHAnsi" w:cstheme="minorBidi"/>
           <w:noProof/>
-          <w:lang w:val="es-PE" w:eastAsia="es-PE"/>
-        </w:rPr>
-      </w:pPr>
-      <w:hyperlink w:anchor="_Toc242980115" w:history="1">
+          <w:lang w:eastAsia="es-PE"/>
+        </w:rPr>
+      </w:pPr>
+      <w:hyperlink w:anchor="_Toc242980541" w:history="1">
         <w:r>
           <w:rPr>
             <w:rStyle w:val="Hipervnculo"/>
             <w:noProof/>
           </w:rPr>
-          <w:t>1.4 Resultados de aprendizaje</w:t>
+          <w:t>Paso D — Análisis de brechas y paquetes de trabajo</w:t>
         </w:r>
         <w:r>
           <w:rPr>
@@ -914,7 +1334,7 @@
             <w:noProof/>
             <w:webHidden/>
           </w:rPr>
-          <w:instrText xml:space="preserve"> PAGEREF _Toc242980115 \h </w:instrText>
+          <w:instrText xml:space="preserve"> PAGEREF _Toc242980541 \h </w:instrText>
         </w:r>
         <w:r>
           <w:rPr>
@@ -934,7 +1354,7 @@
             <w:noProof/>
             <w:webHidden/>
           </w:rPr>
-          <w:t>4</w:t>
+          <w:t>8</w:t>
         </w:r>
         <w:r>
           <w:rPr>
@@ -954,16 +1374,16 @@
         <w:rPr>
           <w:rFonts w:asciiTheme="minorHAnsi" w:eastAsiaTheme="minorEastAsia" w:hAnsiTheme="minorHAnsi" w:cstheme="minorBidi"/>
           <w:noProof/>
-          <w:lang w:val="es-PE" w:eastAsia="es-PE"/>
-        </w:rPr>
-      </w:pPr>
-      <w:hyperlink w:anchor="_Toc242980116" w:history="1">
+          <w:lang w:eastAsia="es-PE"/>
+        </w:rPr>
+      </w:pPr>
+      <w:hyperlink w:anchor="_Toc242980542" w:history="1">
         <w:r>
           <w:rPr>
             <w:rStyle w:val="Hipervnculo"/>
             <w:noProof/>
           </w:rPr>
-          <w:t>1.5 Recursos</w:t>
+          <w:t>Paso E — Vistas y redacción de la Sección 5 del PETI</w:t>
         </w:r>
         <w:r>
           <w:rPr>
@@ -984,7 +1404,7 @@
             <w:noProof/>
             <w:webHidden/>
           </w:rPr>
-          <w:instrText xml:space="preserve"> PAGEREF _Toc242980116 \h </w:instrText>
+          <w:instrText xml:space="preserve"> PAGEREF _Toc242980542 \h </w:instrText>
         </w:r>
         <w:r>
           <w:rPr>
@@ -1004,7 +1424,7 @@
             <w:noProof/>
             <w:webHidden/>
           </w:rPr>
-          <w:t>4</w:t>
+          <w:t>9</w:t>
         </w:r>
         <w:r>
           <w:rPr>
@@ -1024,16 +1444,16 @@
         <w:rPr>
           <w:rFonts w:asciiTheme="minorHAnsi" w:eastAsiaTheme="minorEastAsia" w:hAnsiTheme="minorHAnsi" w:cstheme="minorBidi"/>
           <w:noProof/>
-          <w:lang w:val="es-PE" w:eastAsia="es-PE"/>
-        </w:rPr>
-      </w:pPr>
-      <w:hyperlink w:anchor="_Toc242980117" w:history="1">
+          <w:lang w:eastAsia="es-PE"/>
+        </w:rPr>
+      </w:pPr>
+      <w:hyperlink w:anchor="_Toc242980543" w:history="1">
         <w:r>
           <w:rPr>
             <w:rStyle w:val="Hipervnculo"/>
             <w:noProof/>
           </w:rPr>
-          <w:t>1.6 Seguridad</w:t>
+          <w:t>Paso F — Validar y corregir</w:t>
         </w:r>
         <w:r>
           <w:rPr>
@@ -1054,7 +1474,7 @@
             <w:noProof/>
             <w:webHidden/>
           </w:rPr>
-          <w:instrText xml:space="preserve"> PAGEREF _Toc242980117 \h </w:instrText>
+          <w:instrText xml:space="preserve"> PAGEREF _Toc242980543 \h </w:instrText>
         </w:r>
         <w:r>
           <w:rPr>
@@ -1074,7 +1494,77 @@
             <w:noProof/>
             <w:webHidden/>
           </w:rPr>
-          <w:t>5</w:t>
+          <w:t>9</w:t>
+        </w:r>
+        <w:r>
+          <w:rPr>
+            <w:noProof/>
+            <w:webHidden/>
+          </w:rPr>
+          <w:fldChar w:fldCharType="end"/>
+        </w:r>
+      </w:hyperlink>
+    </w:p>
+    <w:p>
+      <w:pPr>
+        <w:pStyle w:val="TDC2"/>
+        <w:tabs>
+          <w:tab w:val="right" w:leader="dot" w:pos="9344"/>
+        </w:tabs>
+        <w:rPr>
+          <w:rFonts w:asciiTheme="minorHAnsi" w:eastAsiaTheme="minorEastAsia" w:hAnsiTheme="minorHAnsi" w:cstheme="minorBidi"/>
+          <w:noProof/>
+          <w:lang w:eastAsia="es-PE"/>
+        </w:rPr>
+      </w:pPr>
+      <w:hyperlink w:anchor="_Toc242980544" w:history="1">
+        <w:r>
+          <w:rPr>
+            <w:rStyle w:val="Hipervnculo"/>
+            <w:noProof/>
+          </w:rPr>
+          <w:t>Paso G — Registrar la evidencia y cerrar</w:t>
+        </w:r>
+        <w:r>
+          <w:rPr>
+            <w:noProof/>
+            <w:webHidden/>
+          </w:rPr>
+          <w:tab/>
+        </w:r>
+        <w:r>
+          <w:rPr>
+            <w:noProof/>
+            <w:webHidden/>
+          </w:rPr>
+          <w:fldChar w:fldCharType="begin"/>
+        </w:r>
+        <w:r>
+          <w:rPr>
+            <w:noProof/>
+            <w:webHidden/>
+          </w:rPr>
+          <w:instrText xml:space="preserve"> PAGEREF _Toc242980544 \h </w:instrText>
+        </w:r>
+        <w:r>
+          <w:rPr>
+            <w:noProof/>
+            <w:webHidden/>
+          </w:rPr>
+        </w:r>
+        <w:r>
+          <w:rPr>
+            <w:noProof/>
+            <w:webHidden/>
+          </w:rPr>
+          <w:fldChar w:fldCharType="separate"/>
+        </w:r>
+        <w:r>
+          <w:rPr>
+            <w:noProof/>
+            <w:webHidden/>
+          </w:rPr>
+          <w:t>9</w:t>
         </w:r>
         <w:r>
           <w:rPr>
@@ -1094,16 +1584,16 @@
         <w:rPr>
           <w:rFonts w:asciiTheme="minorHAnsi" w:eastAsiaTheme="minorEastAsia" w:hAnsiTheme="minorHAnsi" w:cstheme="minorBidi"/>
           <w:noProof/>
-          <w:lang w:val="es-PE" w:eastAsia="es-PE"/>
-        </w:rPr>
-      </w:pPr>
-      <w:hyperlink w:anchor="_Toc242980118" w:history="1">
+          <w:lang w:eastAsia="es-PE"/>
+        </w:rPr>
+      </w:pPr>
+      <w:hyperlink w:anchor="_Toc242980545" w:history="1">
         <w:r>
           <w:rPr>
             <w:rStyle w:val="Hipervnculo"/>
             <w:noProof/>
           </w:rPr>
-          <w:t>2. Procedimiento o metodología</w:t>
+          <w:t>3. Resultados</w:t>
         </w:r>
         <w:r>
           <w:rPr>
@@ -1124,497 +1614,7 @@
             <w:noProof/>
             <w:webHidden/>
           </w:rPr>
-          <w:instrText xml:space="preserve"> PAGEREF _Toc242980118 \h </w:instrText>
-        </w:r>
-        <w:r>
-          <w:rPr>
-            <w:noProof/>
-            <w:webHidden/>
-          </w:rPr>
-        </w:r>
-        <w:r>
-          <w:rPr>
-            <w:noProof/>
-            <w:webHidden/>
-          </w:rPr>
-          <w:fldChar w:fldCharType="separate"/>
-        </w:r>
-        <w:r>
-          <w:rPr>
-            <w:noProof/>
-            <w:webHidden/>
-          </w:rPr>
-          <w:t>5</w:t>
-        </w:r>
-        <w:r>
-          <w:rPr>
-            <w:noProof/>
-            <w:webHidden/>
-          </w:rPr>
-          <w:fldChar w:fldCharType="end"/>
-        </w:r>
-      </w:hyperlink>
-    </w:p>
-    <w:p>
-      <w:pPr>
-        <w:pStyle w:val="TDC2"/>
-        <w:tabs>
-          <w:tab w:val="right" w:leader="dot" w:pos="9344"/>
-        </w:tabs>
-        <w:rPr>
-          <w:rFonts w:asciiTheme="minorHAnsi" w:eastAsiaTheme="minorEastAsia" w:hAnsiTheme="minorHAnsi" w:cstheme="minorBidi"/>
-          <w:noProof/>
-          <w:lang w:val="es-PE" w:eastAsia="es-PE"/>
-        </w:rPr>
-      </w:pPr>
-      <w:hyperlink w:anchor="_Toc242980119" w:history="1">
-        <w:r>
-          <w:rPr>
-            <w:rStyle w:val="Hipervnculo"/>
-            <w:noProof/>
-          </w:rPr>
-          <w:t>Paso A — Declarar los principios de arquitectura</w:t>
-        </w:r>
-        <w:r>
-          <w:rPr>
-            <w:noProof/>
-            <w:webHidden/>
-          </w:rPr>
-          <w:tab/>
-        </w:r>
-        <w:r>
-          <w:rPr>
-            <w:noProof/>
-            <w:webHidden/>
-          </w:rPr>
-          <w:fldChar w:fldCharType="begin"/>
-        </w:r>
-        <w:r>
-          <w:rPr>
-            <w:noProof/>
-            <w:webHidden/>
-          </w:rPr>
-          <w:instrText xml:space="preserve"> PAGEREF _Toc242980119 \h </w:instrText>
-        </w:r>
-        <w:r>
-          <w:rPr>
-            <w:noProof/>
-            <w:webHidden/>
-          </w:rPr>
-        </w:r>
-        <w:r>
-          <w:rPr>
-            <w:noProof/>
-            <w:webHidden/>
-          </w:rPr>
-          <w:fldChar w:fldCharType="separate"/>
-        </w:r>
-        <w:r>
-          <w:rPr>
-            <w:noProof/>
-            <w:webHidden/>
-          </w:rPr>
-          <w:t>5</w:t>
-        </w:r>
-        <w:r>
-          <w:rPr>
-            <w:noProof/>
-            <w:webHidden/>
-          </w:rPr>
-          <w:fldChar w:fldCharType="end"/>
-        </w:r>
-      </w:hyperlink>
-    </w:p>
-    <w:p>
-      <w:pPr>
-        <w:pStyle w:val="TDC2"/>
-        <w:tabs>
-          <w:tab w:val="right" w:leader="dot" w:pos="9344"/>
-        </w:tabs>
-        <w:rPr>
-          <w:rFonts w:asciiTheme="minorHAnsi" w:eastAsiaTheme="minorEastAsia" w:hAnsiTheme="minorHAnsi" w:cstheme="minorBidi"/>
-          <w:noProof/>
-          <w:lang w:val="es-PE" w:eastAsia="es-PE"/>
-        </w:rPr>
-      </w:pPr>
-      <w:hyperlink w:anchor="_Toc242980120" w:history="1">
-        <w:r>
-          <w:rPr>
-            <w:rStyle w:val="Hipervnculo"/>
-            <w:noProof/>
-          </w:rPr>
-          <w:t>Paso B — Modelar la arquitectura actual (As-Is)</w:t>
-        </w:r>
-        <w:r>
-          <w:rPr>
-            <w:noProof/>
-            <w:webHidden/>
-          </w:rPr>
-          <w:tab/>
-        </w:r>
-        <w:r>
-          <w:rPr>
-            <w:noProof/>
-            <w:webHidden/>
-          </w:rPr>
-          <w:fldChar w:fldCharType="begin"/>
-        </w:r>
-        <w:r>
-          <w:rPr>
-            <w:noProof/>
-            <w:webHidden/>
-          </w:rPr>
-          <w:instrText xml:space="preserve"> PAGEREF _Toc242980120 \h </w:instrText>
-        </w:r>
-        <w:r>
-          <w:rPr>
-            <w:noProof/>
-            <w:webHidden/>
-          </w:rPr>
-        </w:r>
-        <w:r>
-          <w:rPr>
-            <w:noProof/>
-            <w:webHidden/>
-          </w:rPr>
-          <w:fldChar w:fldCharType="separate"/>
-        </w:r>
-        <w:r>
-          <w:rPr>
-            <w:noProof/>
-            <w:webHidden/>
-          </w:rPr>
-          <w:t>6</w:t>
-        </w:r>
-        <w:r>
-          <w:rPr>
-            <w:noProof/>
-            <w:webHidden/>
-          </w:rPr>
-          <w:fldChar w:fldCharType="end"/>
-        </w:r>
-      </w:hyperlink>
-    </w:p>
-    <w:p>
-      <w:pPr>
-        <w:pStyle w:val="TDC2"/>
-        <w:tabs>
-          <w:tab w:val="right" w:leader="dot" w:pos="9344"/>
-        </w:tabs>
-        <w:rPr>
-          <w:rFonts w:asciiTheme="minorHAnsi" w:eastAsiaTheme="minorEastAsia" w:hAnsiTheme="minorHAnsi" w:cstheme="minorBidi"/>
-          <w:noProof/>
-          <w:lang w:val="es-PE" w:eastAsia="es-PE"/>
-        </w:rPr>
-      </w:pPr>
-      <w:hyperlink w:anchor="_Toc242980121" w:history="1">
-        <w:r>
-          <w:rPr>
-            <w:rStyle w:val="Hipervnculo"/>
-            <w:noProof/>
-          </w:rPr>
-          <w:t>Paso C — Modelar la arquitectura objetivo (To-Be)</w:t>
-        </w:r>
-        <w:r>
-          <w:rPr>
-            <w:noProof/>
-            <w:webHidden/>
-          </w:rPr>
-          <w:tab/>
-        </w:r>
-        <w:r>
-          <w:rPr>
-            <w:noProof/>
-            <w:webHidden/>
-          </w:rPr>
-          <w:fldChar w:fldCharType="begin"/>
-        </w:r>
-        <w:r>
-          <w:rPr>
-            <w:noProof/>
-            <w:webHidden/>
-          </w:rPr>
-          <w:instrText xml:space="preserve"> PAGEREF _Toc242980121 \h </w:instrText>
-        </w:r>
-        <w:r>
-          <w:rPr>
-            <w:noProof/>
-            <w:webHidden/>
-          </w:rPr>
-        </w:r>
-        <w:r>
-          <w:rPr>
-            <w:noProof/>
-            <w:webHidden/>
-          </w:rPr>
-          <w:fldChar w:fldCharType="separate"/>
-        </w:r>
-        <w:r>
-          <w:rPr>
-            <w:noProof/>
-            <w:webHidden/>
-          </w:rPr>
-          <w:t>8</w:t>
-        </w:r>
-        <w:r>
-          <w:rPr>
-            <w:noProof/>
-            <w:webHidden/>
-          </w:rPr>
-          <w:fldChar w:fldCharType="end"/>
-        </w:r>
-      </w:hyperlink>
-    </w:p>
-    <w:p>
-      <w:pPr>
-        <w:pStyle w:val="TDC2"/>
-        <w:tabs>
-          <w:tab w:val="right" w:leader="dot" w:pos="9344"/>
-        </w:tabs>
-        <w:rPr>
-          <w:rFonts w:asciiTheme="minorHAnsi" w:eastAsiaTheme="minorEastAsia" w:hAnsiTheme="minorHAnsi" w:cstheme="minorBidi"/>
-          <w:noProof/>
-          <w:lang w:val="es-PE" w:eastAsia="es-PE"/>
-        </w:rPr>
-      </w:pPr>
-      <w:hyperlink w:anchor="_Toc242980122" w:history="1">
-        <w:r>
-          <w:rPr>
-            <w:rStyle w:val="Hipervnculo"/>
-            <w:noProof/>
-          </w:rPr>
-          <w:t>Paso D — Análisis de brechas y paquetes de trabajo</w:t>
-        </w:r>
-        <w:r>
-          <w:rPr>
-            <w:noProof/>
-            <w:webHidden/>
-          </w:rPr>
-          <w:tab/>
-        </w:r>
-        <w:r>
-          <w:rPr>
-            <w:noProof/>
-            <w:webHidden/>
-          </w:rPr>
-          <w:fldChar w:fldCharType="begin"/>
-        </w:r>
-        <w:r>
-          <w:rPr>
-            <w:noProof/>
-            <w:webHidden/>
-          </w:rPr>
-          <w:instrText xml:space="preserve"> PAGEREF _Toc242980122 \h </w:instrText>
-        </w:r>
-        <w:r>
-          <w:rPr>
-            <w:noProof/>
-            <w:webHidden/>
-          </w:rPr>
-        </w:r>
-        <w:r>
-          <w:rPr>
-            <w:noProof/>
-            <w:webHidden/>
-          </w:rPr>
-          <w:fldChar w:fldCharType="separate"/>
-        </w:r>
-        <w:r>
-          <w:rPr>
-            <w:noProof/>
-            <w:webHidden/>
-          </w:rPr>
-          <w:t>9</w:t>
-        </w:r>
-        <w:r>
-          <w:rPr>
-            <w:noProof/>
-            <w:webHidden/>
-          </w:rPr>
-          <w:fldChar w:fldCharType="end"/>
-        </w:r>
-      </w:hyperlink>
-    </w:p>
-    <w:p>
-      <w:pPr>
-        <w:pStyle w:val="TDC2"/>
-        <w:tabs>
-          <w:tab w:val="right" w:leader="dot" w:pos="9344"/>
-        </w:tabs>
-        <w:rPr>
-          <w:rFonts w:asciiTheme="minorHAnsi" w:eastAsiaTheme="minorEastAsia" w:hAnsiTheme="minorHAnsi" w:cstheme="minorBidi"/>
-          <w:noProof/>
-          <w:lang w:val="es-PE" w:eastAsia="es-PE"/>
-        </w:rPr>
-      </w:pPr>
-      <w:hyperlink w:anchor="_Toc242980123" w:history="1">
-        <w:r>
-          <w:rPr>
-            <w:rStyle w:val="Hipervnculo"/>
-            <w:noProof/>
-          </w:rPr>
-          <w:t>Paso E — Vistas y redacción de la Sección 5 del PETI</w:t>
-        </w:r>
-        <w:r>
-          <w:rPr>
-            <w:noProof/>
-            <w:webHidden/>
-          </w:rPr>
-          <w:tab/>
-        </w:r>
-        <w:r>
-          <w:rPr>
-            <w:noProof/>
-            <w:webHidden/>
-          </w:rPr>
-          <w:fldChar w:fldCharType="begin"/>
-        </w:r>
-        <w:r>
-          <w:rPr>
-            <w:noProof/>
-            <w:webHidden/>
-          </w:rPr>
-          <w:instrText xml:space="preserve"> PAGEREF _Toc242980123 \h </w:instrText>
-        </w:r>
-        <w:r>
-          <w:rPr>
-            <w:noProof/>
-            <w:webHidden/>
-          </w:rPr>
-        </w:r>
-        <w:r>
-          <w:rPr>
-            <w:noProof/>
-            <w:webHidden/>
-          </w:rPr>
-          <w:fldChar w:fldCharType="separate"/>
-        </w:r>
-        <w:r>
-          <w:rPr>
-            <w:noProof/>
-            <w:webHidden/>
-          </w:rPr>
-          <w:t>10</w:t>
-        </w:r>
-        <w:r>
-          <w:rPr>
-            <w:noProof/>
-            <w:webHidden/>
-          </w:rPr>
-          <w:fldChar w:fldCharType="end"/>
-        </w:r>
-      </w:hyperlink>
-    </w:p>
-    <w:p>
-      <w:pPr>
-        <w:pStyle w:val="TDC2"/>
-        <w:tabs>
-          <w:tab w:val="right" w:leader="dot" w:pos="9344"/>
-        </w:tabs>
-        <w:rPr>
-          <w:rFonts w:asciiTheme="minorHAnsi" w:eastAsiaTheme="minorEastAsia" w:hAnsiTheme="minorHAnsi" w:cstheme="minorBidi"/>
-          <w:noProof/>
-          <w:lang w:val="es-PE" w:eastAsia="es-PE"/>
-        </w:rPr>
-      </w:pPr>
-      <w:hyperlink w:anchor="_Toc242980124" w:history="1">
-        <w:r>
-          <w:rPr>
-            <w:rStyle w:val="Hipervnculo"/>
-            <w:noProof/>
-          </w:rPr>
-          <w:t>Paso F — Validar y corregir</w:t>
-        </w:r>
-        <w:r>
-          <w:rPr>
-            <w:noProof/>
-            <w:webHidden/>
-          </w:rPr>
-          <w:tab/>
-        </w:r>
-        <w:r>
-          <w:rPr>
-            <w:noProof/>
-            <w:webHidden/>
-          </w:rPr>
-          <w:fldChar w:fldCharType="begin"/>
-        </w:r>
-        <w:r>
-          <w:rPr>
-            <w:noProof/>
-            <w:webHidden/>
-          </w:rPr>
-          <w:instrText xml:space="preserve"> PAGEREF _Toc242980124 \h </w:instrText>
-        </w:r>
-        <w:r>
-          <w:rPr>
-            <w:noProof/>
-            <w:webHidden/>
-          </w:rPr>
-        </w:r>
-        <w:r>
-          <w:rPr>
-            <w:noProof/>
-            <w:webHidden/>
-          </w:rPr>
-          <w:fldChar w:fldCharType="separate"/>
-        </w:r>
-        <w:r>
-          <w:rPr>
-            <w:noProof/>
-            <w:webHidden/>
-          </w:rPr>
-          <w:t>10</w:t>
-        </w:r>
-        <w:r>
-          <w:rPr>
-            <w:noProof/>
-            <w:webHidden/>
-          </w:rPr>
-          <w:fldChar w:fldCharType="end"/>
-        </w:r>
-      </w:hyperlink>
-    </w:p>
-    <w:p>
-      <w:pPr>
-        <w:pStyle w:val="TDC2"/>
-        <w:tabs>
-          <w:tab w:val="right" w:leader="dot" w:pos="9344"/>
-        </w:tabs>
-        <w:rPr>
-          <w:rFonts w:asciiTheme="minorHAnsi" w:eastAsiaTheme="minorEastAsia" w:hAnsiTheme="minorHAnsi" w:cstheme="minorBidi"/>
-          <w:noProof/>
-          <w:lang w:val="es-PE" w:eastAsia="es-PE"/>
-        </w:rPr>
-      </w:pPr>
-      <w:hyperlink w:anchor="_Toc242980125" w:history="1">
-        <w:r>
-          <w:rPr>
-            <w:rStyle w:val="Hipervnculo"/>
-            <w:noProof/>
-          </w:rPr>
-          <w:t>Paso G — Registrar la evidencia y cerrar</w:t>
-        </w:r>
-        <w:r>
-          <w:rPr>
-            <w:noProof/>
-            <w:webHidden/>
-          </w:rPr>
-          <w:tab/>
-        </w:r>
-        <w:r>
-          <w:rPr>
-            <w:noProof/>
-            <w:webHidden/>
-          </w:rPr>
-          <w:fldChar w:fldCharType="begin"/>
-        </w:r>
-        <w:r>
-          <w:rPr>
-            <w:noProof/>
-            <w:webHidden/>
-          </w:rPr>
-          <w:instrText xml:space="preserve"> PAGEREF _Toc242980125 \h </w:instrText>
+          <w:instrText xml:space="preserve"> PAGEREF _Toc242980545 \h </w:instrText>
         </w:r>
         <w:r>
           <w:rPr>
@@ -1654,16 +1654,16 @@
         <w:rPr>
           <w:rFonts w:asciiTheme="minorHAnsi" w:eastAsiaTheme="minorEastAsia" w:hAnsiTheme="minorHAnsi" w:cstheme="minorBidi"/>
           <w:noProof/>
-          <w:lang w:val="es-PE" w:eastAsia="es-PE"/>
-        </w:rPr>
-      </w:pPr>
-      <w:hyperlink w:anchor="_Toc242980126" w:history="1">
+          <w:lang w:eastAsia="es-PE"/>
+        </w:rPr>
+      </w:pPr>
+      <w:hyperlink w:anchor="_Toc242980546" w:history="1">
         <w:r>
           <w:rPr>
             <w:rStyle w:val="Hipervnculo"/>
             <w:noProof/>
           </w:rPr>
-          <w:t>3. Resultados</w:t>
+          <w:t>4. Conclusiones</w:t>
         </w:r>
         <w:r>
           <w:rPr>
@@ -1684,7 +1684,7 @@
             <w:noProof/>
             <w:webHidden/>
           </w:rPr>
-          <w:instrText xml:space="preserve"> PAGEREF _Toc242980126 \h </w:instrText>
+          <w:instrText xml:space="preserve"> PAGEREF _Toc242980546 \h </w:instrText>
         </w:r>
         <w:r>
           <w:rPr>
@@ -1724,16 +1724,16 @@
         <w:rPr>
           <w:rFonts w:asciiTheme="minorHAnsi" w:eastAsiaTheme="minorEastAsia" w:hAnsiTheme="minorHAnsi" w:cstheme="minorBidi"/>
           <w:noProof/>
-          <w:lang w:val="es-PE" w:eastAsia="es-PE"/>
-        </w:rPr>
-      </w:pPr>
-      <w:hyperlink w:anchor="_Toc242980127" w:history="1">
+          <w:lang w:eastAsia="es-PE"/>
+        </w:rPr>
+      </w:pPr>
+      <w:hyperlink w:anchor="_Toc242980547" w:history="1">
         <w:r>
           <w:rPr>
             <w:rStyle w:val="Hipervnculo"/>
             <w:noProof/>
           </w:rPr>
-          <w:t>4. Conclusiones</w:t>
+          <w:t>5. Cuestionario</w:t>
         </w:r>
         <w:r>
           <w:rPr>
@@ -1754,7 +1754,7 @@
             <w:noProof/>
             <w:webHidden/>
           </w:rPr>
-          <w:instrText xml:space="preserve"> PAGEREF _Toc242980127 \h </w:instrText>
+          <w:instrText xml:space="preserve"> PAGEREF _Toc242980547 \h </w:instrText>
         </w:r>
         <w:r>
           <w:rPr>
@@ -1794,16 +1794,16 @@
         <w:rPr>
           <w:rFonts w:asciiTheme="minorHAnsi" w:eastAsiaTheme="minorEastAsia" w:hAnsiTheme="minorHAnsi" w:cstheme="minorBidi"/>
           <w:noProof/>
-          <w:lang w:val="es-PE" w:eastAsia="es-PE"/>
-        </w:rPr>
-      </w:pPr>
-      <w:hyperlink w:anchor="_Toc242980128" w:history="1">
+          <w:lang w:eastAsia="es-PE"/>
+        </w:rPr>
+      </w:pPr>
+      <w:hyperlink w:anchor="_Toc242980548" w:history="1">
         <w:r>
           <w:rPr>
             <w:rStyle w:val="Hipervnculo"/>
             <w:noProof/>
           </w:rPr>
-          <w:t>5. Cuestionario</w:t>
+          <w:t>6. Referencias bibliográficas</w:t>
         </w:r>
         <w:r>
           <w:rPr>
@@ -1824,7 +1824,7 @@
             <w:noProof/>
             <w:webHidden/>
           </w:rPr>
-          <w:instrText xml:space="preserve"> PAGEREF _Toc242980128 \h </w:instrText>
+          <w:instrText xml:space="preserve"> PAGEREF _Toc242980548 \h </w:instrText>
         </w:r>
         <w:r>
           <w:rPr>
@@ -1844,7 +1844,7 @@
             <w:noProof/>
             <w:webHidden/>
           </w:rPr>
-          <w:t>13</w:t>
+          <w:t>12</w:t>
         </w:r>
         <w:r>
           <w:rPr>
@@ -1864,16 +1864,16 @@
         <w:rPr>
           <w:rFonts w:asciiTheme="minorHAnsi" w:eastAsiaTheme="minorEastAsia" w:hAnsiTheme="minorHAnsi" w:cstheme="minorBidi"/>
           <w:noProof/>
-          <w:lang w:val="es-PE" w:eastAsia="es-PE"/>
-        </w:rPr>
-      </w:pPr>
-      <w:hyperlink w:anchor="_Toc242980129" w:history="1">
+          <w:lang w:eastAsia="es-PE"/>
+        </w:rPr>
+      </w:pPr>
+      <w:hyperlink w:anchor="_Toc242980549" w:history="1">
         <w:r>
           <w:rPr>
             <w:rStyle w:val="Hipervnculo"/>
             <w:noProof/>
           </w:rPr>
-          <w:t>6. Referencias bibliográficas</w:t>
+          <w:t>7. Anexos</w:t>
         </w:r>
         <w:r>
           <w:rPr>
@@ -1894,7 +1894,7 @@
             <w:noProof/>
             <w:webHidden/>
           </w:rPr>
-          <w:instrText xml:space="preserve"> PAGEREF _Toc242980129 \h </w:instrText>
+          <w:instrText xml:space="preserve"> PAGEREF _Toc242980549 \h </w:instrText>
         </w:r>
         <w:r>
           <w:rPr>
@@ -1926,260 +1926,8 @@
       </w:hyperlink>
     </w:p>
     <w:p>
-      <w:pPr>
-        <w:pStyle w:val="TDC1"/>
-        <w:tabs>
-          <w:tab w:val="right" w:leader="dot" w:pos="9344"/>
-        </w:tabs>
-        <w:rPr>
-          <w:rFonts w:asciiTheme="minorHAnsi" w:eastAsiaTheme="minorEastAsia" w:hAnsiTheme="minorHAnsi" w:cstheme="minorBidi"/>
-          <w:noProof/>
-          <w:lang w:val="es-PE" w:eastAsia="es-PE"/>
-        </w:rPr>
-      </w:pPr>
-      <w:hyperlink w:anchor="_Toc242980130" w:history="1">
-        <w:r>
-          <w:rPr>
-            <w:rStyle w:val="Hipervnculo"/>
-            <w:noProof/>
-          </w:rPr>
-          <w:t>7. Anexos</w:t>
-        </w:r>
-        <w:r>
-          <w:rPr>
-            <w:noProof/>
-            <w:webHidden/>
-          </w:rPr>
-          <w:tab/>
-        </w:r>
-        <w:r>
-          <w:rPr>
-            <w:noProof/>
-            <w:webHidden/>
-          </w:rPr>
-          <w:fldChar w:fldCharType="begin"/>
-        </w:r>
-        <w:r>
-          <w:rPr>
-            <w:noProof/>
-            <w:webHidden/>
-          </w:rPr>
-          <w:instrText xml:space="preserve"> PAGEREF _Toc242980130 \h </w:instrText>
-        </w:r>
-        <w:r>
-          <w:rPr>
-            <w:noProof/>
-            <w:webHidden/>
-          </w:rPr>
-        </w:r>
-        <w:r>
-          <w:rPr>
-            <w:noProof/>
-            <w:webHidden/>
-          </w:rPr>
-          <w:fldChar w:fldCharType="separate"/>
-        </w:r>
-        <w:r>
-          <w:rPr>
-            <w:noProof/>
-            <w:webHidden/>
-          </w:rPr>
-          <w:t>14</w:t>
-        </w:r>
-        <w:r>
-          <w:rPr>
-            <w:noProof/>
-            <w:webHidden/>
-          </w:rPr>
-          <w:fldChar w:fldCharType="end"/>
-        </w:r>
-      </w:hyperlink>
-    </w:p>
-    <w:p>
       <w:r>
         <w:fldChar w:fldCharType="end"/>
-      </w:r>
-    </w:p>
-    <w:p>
-      <w:r>
-        <w:br w:type="page"/>
-      </w:r>
-    </w:p>
-    <w:p>
-      <w:pPr>
-        <w:pStyle w:val="Ttulo1"/>
-      </w:pPr>
-      <w:bookmarkStart w:id="2" w:name="_Toc242980110"/>
-      <w:r>
-        <w:lastRenderedPageBreak/>
-        <w:t>Cómo se usa esta plantilla</w:t>
-      </w:r>
-      <w:bookmarkEnd w:id="2"/>
-    </w:p>
-    <w:p>
-      <w:pPr>
-        <w:pStyle w:val="FirstParagraph"/>
-      </w:pPr>
-      <w:r>
-        <w:t xml:space="preserve">Este es el formato en el que se entrega </w:t>
-      </w:r>
-      <w:r>
-        <w:rPr>
-          <w:b/>
-          <w:bCs/>
-        </w:rPr>
-        <w:t>todo informe de taller de SI-886</w:t>
-      </w:r>
-      <w:r>
-        <w:t xml:space="preserve">. Se llena en Word y se entrega en </w:t>
-      </w:r>
-      <w:r>
-        <w:rPr>
-          <w:b/>
-          <w:bCs/>
-        </w:rPr>
-        <w:t>PDF</w:t>
-      </w:r>
-      <w:r>
-        <w:t>.</w:t>
-      </w:r>
-    </w:p>
-    <w:p>
-      <w:pPr>
-        <w:pStyle w:val="Compact"/>
-        <w:numPr>
-          <w:ilvl w:val="0"/>
-          <w:numId w:val="2"/>
-        </w:numPr>
-      </w:pPr>
-      <w:r>
-        <w:t>Guarda</w:t>
-      </w:r>
-      <w:r>
-        <w:t xml:space="preserve"> una copia con el nombre </w:t>
-      </w:r>
-      <w:r>
-        <w:rPr>
-          <w:rStyle w:val="VerbatimChar"/>
-          <w:b/>
-          <w:bCs/>
-        </w:rPr>
-        <w:t>SI886-S&lt;NN&gt;-TALLER-Grupo&lt;N&gt;.pdf</w:t>
-      </w:r>
-      <w:r>
-        <w:t xml:space="preserve">. Por ejemplo, </w:t>
-      </w:r>
-      <w:r>
-        <w:rPr>
-          <w:rStyle w:val="VerbatimChar"/>
-        </w:rPr>
-        <w:t>SI886-S03-TALLER-Grupo4.pdf</w:t>
-      </w:r>
-      <w:r>
-        <w:t>.</w:t>
-      </w:r>
-    </w:p>
-    <w:p>
-      <w:pPr>
-        <w:pStyle w:val="Compact"/>
-        <w:numPr>
-          <w:ilvl w:val="0"/>
-          <w:numId w:val="2"/>
-        </w:numPr>
-      </w:pPr>
-      <w:r>
-        <w:t>Completa la carátula. Escribe los integrantes con apellidos, nombres y código, uno por línea.</w:t>
-      </w:r>
-    </w:p>
-    <w:p>
-      <w:pPr>
-        <w:pStyle w:val="Compact"/>
-        <w:numPr>
-          <w:ilvl w:val="0"/>
-          <w:numId w:val="2"/>
-        </w:numPr>
-      </w:pPr>
-      <w:r>
-        <w:t xml:space="preserve">Copia el enunciado de cada sección desde el archivo </w:t>
-      </w:r>
-      <w:r>
-        <w:rPr>
-          <w:rStyle w:val="VerbatimChar"/>
-        </w:rPr>
-        <w:t>3-TALLER.m</w:t>
-      </w:r>
-      <w:r>
-        <w:rPr>
-          <w:rStyle w:val="VerbatimChar"/>
-        </w:rPr>
-        <w:t>d</w:t>
-      </w:r>
-      <w:r>
-        <w:t xml:space="preserve"> de la semana. Las siete secciones son las del formato EPIS y van en este orden.</w:t>
-      </w:r>
-    </w:p>
-    <w:p>
-      <w:pPr>
-        <w:pStyle w:val="Compact"/>
-        <w:numPr>
-          <w:ilvl w:val="0"/>
-          <w:numId w:val="2"/>
-        </w:numPr>
-      </w:pPr>
-      <w:r>
-        <w:t xml:space="preserve">Actualiza el índice antes de exportar. Clic derecho sobre el índice y luego </w:t>
-      </w:r>
-      <w:r>
-        <w:rPr>
-          <w:b/>
-          <w:bCs/>
-        </w:rPr>
-        <w:t>Actualizar campos</w:t>
-      </w:r>
-      <w:r>
-        <w:t>.</w:t>
-      </w:r>
-    </w:p>
-    <w:p>
-      <w:pPr>
-        <w:pStyle w:val="Compact"/>
-        <w:numPr>
-          <w:ilvl w:val="0"/>
-          <w:numId w:val="2"/>
-        </w:numPr>
-      </w:pPr>
-      <w:r>
-        <w:t xml:space="preserve">Exporta con </w:t>
-      </w:r>
-      <w:r>
-        <w:rPr>
-          <w:b/>
-          <w:bCs/>
-        </w:rPr>
-        <w:t>Archivo → Guardar como → PDF</w:t>
-      </w:r>
-      <w:r>
-        <w:t xml:space="preserve">. No entregues el </w:t>
-      </w:r>
-      <w:r>
-        <w:rPr>
-          <w:rStyle w:val="VerbatimChar"/>
-        </w:rPr>
-        <w:t>.docx</w:t>
-      </w:r>
-      <w:r>
-        <w:t>.</w:t>
-      </w:r>
-    </w:p>
-    <w:p>
-      <w:pPr>
-        <w:pStyle w:val="FirstParagraph"/>
-      </w:pPr>
-      <w:r>
-        <w:t xml:space="preserve">Borra esta </w:t>
-      </w:r>
-      <w:r>
-        <w:t>página antes de entregar.</w:t>
       </w:r>
     </w:p>
     <w:p>
@@ -2192,23 +1940,23 @@
         <w:pStyle w:val="Ttulo1"/>
         <w:spacing w:after="120"/>
       </w:pPr>
-      <w:bookmarkStart w:id="3" w:name="_Toc242980111"/>
+      <w:bookmarkStart w:id="2" w:name="_Toc242980530"/>
       <w:r>
         <w:lastRenderedPageBreak/>
         <w:t>1. Información sobre el evento práctico</w:t>
       </w:r>
-      <w:bookmarkEnd w:id="3"/>
+      <w:bookmarkEnd w:id="2"/>
     </w:p>
     <w:p>
       <w:pPr>
         <w:pStyle w:val="Ttulo2"/>
         <w:spacing w:after="80"/>
       </w:pPr>
-      <w:bookmarkStart w:id="4" w:name="_Toc242980112"/>
+      <w:bookmarkStart w:id="3" w:name="_Toc242980531"/>
       <w:r>
         <w:t>1.1 Título del evento práctico</w:t>
       </w:r>
-      <w:bookmarkEnd w:id="4"/>
+      <w:bookmarkEnd w:id="3"/>
     </w:p>
     <w:p>
       <w:pPr>
@@ -2227,11 +1975,11 @@
         <w:pStyle w:val="Ttulo2"/>
         <w:spacing w:after="80"/>
       </w:pPr>
-      <w:bookmarkStart w:id="5" w:name="_Toc242980113"/>
+      <w:bookmarkStart w:id="4" w:name="_Toc242980532"/>
       <w:r>
         <w:t>1.2 Objetivos</w:t>
       </w:r>
-      <w:bookmarkEnd w:id="5"/>
+      <w:bookmarkEnd w:id="4"/>
     </w:p>
     <w:p>
       <w:pPr>
@@ -2250,13 +1998,7 @@
         <w:rPr>
           <w:color w:val="000000"/>
         </w:rPr>
-        <w:t>Declarar los pri</w:t>
-      </w:r>
-      <w:r>
-        <w:rPr>
-          <w:color w:val="000000"/>
-        </w:rPr>
-        <w:t>ncipios de arquitectura que gobernarán las decisiones del plan estratégico de TI.</w:t>
+        <w:t>Declarar los principios de arquitectura que gobernarán las decisiones del plan estratégico de TI.</w:t>
       </w:r>
     </w:p>
     <w:p>
@@ -2296,13 +2038,7 @@
         <w:rPr>
           <w:color w:val="000000"/>
         </w:rPr>
-        <w:t>Construir la vista de cooperación proceso-aplicación y detectar procesos sin soporte o con sop</w:t>
-      </w:r>
-      <w:r>
-        <w:rPr>
-          <w:color w:val="000000"/>
-        </w:rPr>
-        <w:t>orte deficiente.</w:t>
+        <w:t>Construir la vista de cooperación proceso-aplicación y detectar procesos sin soporte o con soporte deficiente.</w:t>
       </w:r>
     </w:p>
     <w:p>
@@ -2362,13 +2098,7 @@
         <w:rPr>
           <w:color w:val="000000"/>
         </w:rPr>
-        <w:t>Ejecutar</w:t>
-      </w:r>
-      <w:r>
-        <w:rPr>
-          <w:color w:val="000000"/>
-        </w:rPr>
-        <w:t xml:space="preserve"> el análisis de brechas mediante script automatizado en Python y derivar los paquetes de trabajo.</w:t>
+        <w:t>Ejecutar el análisis de brechas mediante script automatizado en Python y derivar los paquetes de trabajo.</w:t>
       </w:r>
     </w:p>
     <w:p>
@@ -2396,11 +2126,11 @@
         <w:pStyle w:val="Ttulo2"/>
         <w:spacing w:after="80"/>
       </w:pPr>
-      <w:bookmarkStart w:id="6" w:name="_Toc242980114"/>
+      <w:bookmarkStart w:id="5" w:name="_Toc242980533"/>
       <w:r>
         <w:t>1.3 Tiempo de duración</w:t>
       </w:r>
-      <w:bookmarkEnd w:id="6"/>
+      <w:bookmarkEnd w:id="5"/>
     </w:p>
     <w:p>
       <w:pPr>
@@ -2419,11 +2149,11 @@
         <w:pStyle w:val="Ttulo2"/>
         <w:spacing w:after="80"/>
       </w:pPr>
-      <w:bookmarkStart w:id="7" w:name="_Toc242980115"/>
+      <w:bookmarkStart w:id="6" w:name="_Toc242980534"/>
       <w:r>
         <w:t>1.4 Resultados de aprendizaje</w:t>
       </w:r>
-      <w:bookmarkEnd w:id="7"/>
+      <w:bookmarkEnd w:id="6"/>
     </w:p>
     <w:p>
       <w:pPr>
@@ -2442,13 +2172,7 @@
         <w:rPr>
           <w:color w:val="000000"/>
         </w:rPr>
-        <w:t>Aplica e</w:t>
-      </w:r>
-      <w:r>
-        <w:rPr>
-          <w:color w:val="000000"/>
-        </w:rPr>
-        <w:t>l estándar ArchiMate 3.2 y el método TOGAF ADM para modelar arquitecturas de TI en organizaciones reales.</w:t>
+        <w:t>Aplica el estándar ArchiMate 3.2 y el método TOGAF ADM para modelar arquitecturas de TI en organizaciones reales.</w:t>
       </w:r>
     </w:p>
     <w:p>
@@ -2488,13 +2212,7 @@
         <w:rPr>
           <w:color w:val="000000"/>
         </w:rPr>
-        <w:t>Diagnostic</w:t>
-      </w:r>
-      <w:r>
-        <w:rPr>
-          <w:color w:val="000000"/>
-        </w:rPr>
-        <w:t>a inconsistencias y vacíos en la capa de datos, estableciendo fuentes autoritativas y dueños por cargo directivo.</w:t>
+        <w:t>Diagnostica inconsistencias y vacíos en la capa de datos, estableciendo fuentes autoritativas y dueños por cargo directivo.</w:t>
       </w:r>
     </w:p>
     <w:p>
@@ -2522,11 +2240,11 @@
         <w:pStyle w:val="Ttulo2"/>
         <w:spacing w:after="80"/>
       </w:pPr>
-      <w:bookmarkStart w:id="8" w:name="_Toc242980116"/>
+      <w:bookmarkStart w:id="7" w:name="_Toc242980535"/>
       <w:r>
         <w:t>1.5 Recursos</w:t>
       </w:r>
-      <w:bookmarkEnd w:id="8"/>
+      <w:bookmarkEnd w:id="7"/>
     </w:p>
     <w:p>
       <w:pPr>
@@ -2537,13 +2255,7 @@
         <w:rPr>
           <w:color w:val="000000"/>
         </w:rPr>
-        <w:t>P</w:t>
-      </w:r>
-      <w:r>
-        <w:rPr>
-          <w:color w:val="000000"/>
-        </w:rPr>
-        <w:t>ara el desarrollo del presente taller práctico se emplearon los siguientes recursos:</w:t>
+        <w:t>Para el desarrollo del presente taller práctico se emplearon los siguientes recursos:</w:t>
       </w:r>
     </w:p>
     <w:tbl>
@@ -2725,15 +2437,7 @@
                 <w:color w:val="000000"/>
                 <w:sz w:val="18"/>
               </w:rPr>
-              <w:t xml:space="preserve">Python &amp; </w:t>
-            </w:r>
-            <w:r>
-              <w:rPr>
-                <w:b/>
-                <w:color w:val="000000"/>
-                <w:sz w:val="18"/>
-              </w:rPr>
-              <w:t>pandas</w:t>
+              <w:t>Python &amp; pandas</w:t>
             </w:r>
           </w:p>
         </w:tc>
@@ -2839,14 +2543,7 @@
                 <w:color w:val="000000"/>
                 <w:sz w:val="18"/>
               </w:rPr>
-              <w:t>Control de versiones oficial y aseguramiento de evidencias enlazadas: https://github.com/Gianfranc</w:t>
-            </w:r>
-            <w:r>
-              <w:rPr>
-                <w:color w:val="000000"/>
-                <w:sz w:val="18"/>
-              </w:rPr>
-              <w:t>oArocutipa/Taller10_Empresa_01</w:t>
+              <w:t>Control de versiones oficial y aseguramiento de evidencias enlazadas: https://github.com/GianfrancoArocutipa/Taller10_Empresa_01</w:t>
             </w:r>
             <w:r>
               <w:rPr>
@@ -3119,14 +2816,7 @@
                 <w:color w:val="000000"/>
                 <w:sz w:val="18"/>
               </w:rPr>
-              <w:t>B</w:t>
-            </w:r>
-            <w:r>
-              <w:rPr>
-                <w:color w:val="000000"/>
-                <w:sz w:val="18"/>
-              </w:rPr>
-              <w:t>uenas prácticas de gestión de arquitectura empresarial (APO03) y continuidad operativa (DSS04).</w:t>
+              <w:t>Buenas prácticas de gestión de arquitectura empresarial (APO03) y continuidad operativa (DSS04).</w:t>
             </w:r>
           </w:p>
         </w:tc>
@@ -3137,11 +2827,11 @@
         <w:pStyle w:val="Ttulo2"/>
         <w:spacing w:after="80"/>
       </w:pPr>
-      <w:bookmarkStart w:id="9" w:name="_Toc242980117"/>
+      <w:bookmarkStart w:id="8" w:name="_Toc242980536"/>
       <w:r>
         <w:t>1.6 Seguridad</w:t>
       </w:r>
-      <w:bookmarkEnd w:id="9"/>
+      <w:bookmarkEnd w:id="8"/>
     </w:p>
     <w:p>
       <w:pPr>
@@ -3160,13 +2850,7 @@
         <w:rPr>
           <w:color w:val="000000"/>
         </w:rPr>
-        <w:t xml:space="preserve">El modelo de arquitectura describe la superficie completa de sistemas de Agroexportadora Valle Viejo S.A.C. Al ser información Restringida, no </w:t>
-      </w:r>
-      <w:r>
-        <w:rPr>
-          <w:color w:val="000000"/>
-        </w:rPr>
-        <w:t>se divulgan rutas internas, credenciales ni direcciones IP.</w:t>
+        <w:t>El modelo de arquitectura describe la superficie completa de sistemas de Agroexportadora Valle Viejo S.A.C. Al ser información Restringida, no se divulgan rutas internas, credenciales ni direcciones IP.</w:t>
       </w:r>
     </w:p>
     <w:p>
@@ -3206,13 +2890,7 @@
         <w:rPr>
           <w:color w:val="000000"/>
         </w:rPr>
-        <w:t>El archivo del modelo '.archimate' y los datasets se resguardan en el repositorio del equ</w:t>
-      </w:r>
-      <w:r>
-        <w:rPr>
-          <w:color w:val="000000"/>
-        </w:rPr>
-        <w:t>ipo bajo control de versiones.</w:t>
+        <w:t>El archivo del modelo '.archimate' y los datasets se resguardan en el repositorio del equipo bajo control de versiones.</w:t>
       </w:r>
     </w:p>
     <w:p>
@@ -3220,11 +2898,11 @@
         <w:pStyle w:val="Ttulo1"/>
         <w:spacing w:after="120"/>
       </w:pPr>
-      <w:bookmarkStart w:id="10" w:name="_Toc242980118"/>
+      <w:bookmarkStart w:id="9" w:name="_Toc242980537"/>
       <w:r>
         <w:t>2. Procedimiento o metodología</w:t>
       </w:r>
-      <w:bookmarkEnd w:id="10"/>
+      <w:bookmarkEnd w:id="9"/>
     </w:p>
     <w:p>
       <w:pPr>
@@ -3243,11 +2921,11 @@
         <w:pStyle w:val="Ttulo2"/>
         <w:spacing w:after="80"/>
       </w:pPr>
-      <w:bookmarkStart w:id="11" w:name="_Toc242980119"/>
+      <w:bookmarkStart w:id="10" w:name="_Toc242980538"/>
       <w:r>
         <w:t>Paso A — Declarar los principios de arquitectura</w:t>
       </w:r>
-      <w:bookmarkEnd w:id="11"/>
+      <w:bookmarkEnd w:id="10"/>
     </w:p>
     <w:p>
       <w:pPr>
@@ -3266,13 +2944,7 @@
         <w:rPr>
           <w:color w:val="000000"/>
         </w:rPr>
-        <w:t xml:space="preserve">Definir las </w:t>
-      </w:r>
-      <w:r>
-        <w:rPr>
-          <w:color w:val="000000"/>
-        </w:rPr>
-        <w:t>reglas directrices obligatorias que gobernarán las decisiones del PETI de Agroexportadora Valle Viejo S.A.C., articuladas con los hallazgos del diagnóstico e incidentes conocidos.</w:t>
+        <w:t>Definir las reglas directrices obligatorias que gobernarán las decisiones del PETI de Agroexportadora Valle Viejo S.A.C., articuladas con los hallazgos del diagnóstico e incidentes conocidos.</w:t>
       </w:r>
     </w:p>
     <w:p>
@@ -3280,6 +2952,9 @@
         <w:pStyle w:val="Compact"/>
         <w:spacing w:after="60" w:line="276" w:lineRule="auto"/>
         <w:ind w:left="360"/>
+        <w:rPr>
+          <w:lang w:val="en-US"/>
+        </w:rPr>
       </w:pPr>
       <w:r>
         <w:rPr>
@@ -3292,13 +2967,14 @@
         <w:rPr>
           <w:color w:val="000000"/>
         </w:rPr>
-        <w:t>Redacción formal de '05_arquitectura/AR01_principios.md'</w:t>
-      </w:r>
-      <w:r>
-        <w:rPr>
-          <w:color w:val="000000"/>
-        </w:rPr>
-        <w:t>, definiendo seis principios bajo el estándar TOGAF (Nombre, Declaración, Razón, Implicancias y Trazabilidad). Enlace: https://github.com/GianfrancoArocutipa/Taller10_Empresa_01_Exportadora/tree/taller-10/05_arquitectura/AR01_principios.md</w:t>
+        <w:t xml:space="preserve">Redacción formal de '05_arquitectura/AR01_principios.md', definiendo seis principios bajo el estándar TOGAF (Nombre, Declaración, Razón, Implicancias y Trazabilidad). </w:t>
+      </w:r>
+      <w:r>
+        <w:rPr>
+          <w:color w:val="000000"/>
+          <w:lang w:val="en-US"/>
+        </w:rPr>
+        <w:t>Enlace: https://github.com/GianfrancoArocutipa/Taller10_Empresa_01_Exportadora/tree/taller-10/05_arquitectura/AR01_principios.md</w:t>
       </w:r>
     </w:p>
     <w:p>
@@ -3312,14 +2988,7 @@
           <w:b/>
           <w:color w:val="000000"/>
         </w:rPr>
-        <w:t>• Evidencia de q</w:t>
-      </w:r>
-      <w:r>
-        <w:rPr>
-          <w:b/>
-          <w:color w:val="000000"/>
-        </w:rPr>
-        <w:t xml:space="preserve">ue funcionó: </w:t>
+        <w:t xml:space="preserve">• Evidencia de que funcionó: </w:t>
       </w:r>
       <w:r>
         <w:rPr>
@@ -3344,13 +3013,7 @@
         <w:rPr>
           <w:sz w:val="19"/>
         </w:rPr>
-        <w:t xml:space="preserve"> Cada entidad crítica (Lote, Productor, Pesaje) posee una única fuente autoritativa en el ERP y un dueño por cargo directivo. Razón: </w:t>
-      </w:r>
-      <w:r>
-        <w:rPr>
-          <w:sz w:val="19"/>
-        </w:rPr>
-        <w:t>discrepancia de hasta 6% en kilos por lote y 32 productores no registrados en el ERP.</w:t>
+        <w:t xml:space="preserve"> Cada entidad crítica (Lote, Productor, Pesaje) posee una única fuente autoritativa en el ERP y un dueño por cargo directivo. Razón: discrepancia de hasta 6% en kilos por lote y 32 productores no registrados en el ERP.</w:t>
       </w:r>
     </w:p>
     <w:p>
@@ -3369,13 +3032,7 @@
         <w:rPr>
           <w:sz w:val="19"/>
         </w:rPr>
-        <w:t xml:space="preserve"> Registro en tiempo real desde la recepción de la aceituna hasta el embarque aduanero sin digitación manu</w:t>
-      </w:r>
-      <w:r>
-        <w:rPr>
-          <w:sz w:val="19"/>
-        </w:rPr>
-        <w:t>al diferida. Razón: exigencia SENASA y clientes de Europa; el cierre de trazabilidad tardaba 11 días.</w:t>
+        <w:t xml:space="preserve"> Registro en tiempo real desde la recepción de la aceituna hasta el embarque aduanero sin digitación manual diferida. Razón: exigencia SENASA y clientes de Europa; el cierre de trazabilidad tardaba 11 días.</w:t>
       </w:r>
     </w:p>
     <w:p>
@@ -3394,13 +3051,7 @@
         <w:rPr>
           <w:sz w:val="19"/>
         </w:rPr>
-        <w:t xml:space="preserve"> Interconexión mediante APIs REST y servicios web, erradicando la transcripción manual</w:t>
-      </w:r>
-      <w:r>
-        <w:rPr>
-          <w:sz w:val="19"/>
-        </w:rPr>
-        <w:t xml:space="preserve"> entre la balanza, el ERP y planillas. Razón: la balanza se transcribía en papel al día siguiente.</w:t>
+        <w:t xml:space="preserve"> Interconexión mediante APIs REST y servicios web, erradicando la transcripción manual entre la balanza, el ERP y planillas. Razón: la balanza se transcribía en papel al día siguiente.</w:t>
       </w:r>
     </w:p>
     <w:p>
@@ -3420,13 +3071,7 @@
         <w:rPr>
           <w:sz w:val="19"/>
         </w:rPr>
-        <w:t xml:space="preserve"> Alta disponibilidad, respaldo inmutable en la nube (RPO ≤ 1h, RTO ≤ 4h) y </w:t>
-      </w:r>
-      <w:r>
-        <w:rPr>
-          <w:sz w:val="19"/>
-        </w:rPr>
-        <w:t>UPS corporativo. Razón: servidor único con UPS de 10 min y pérdida de la base de datos de campaña 2024 en la PC de planta.</w:t>
+        <w:t xml:space="preserve"> Alta disponibilidad, respaldo inmutable en la nube (RPO ≤ 1h, RTO ≤ 4h) y UPS corporativo. Razón: servidor único con UPS de 10 min y pérdida de la base de datos de campaña 2024 en la PC de planta.</w:t>
       </w:r>
     </w:p>
     <w:p>
@@ -3445,13 +3090,7 @@
         <w:rPr>
           <w:sz w:val="19"/>
         </w:rPr>
-        <w:t xml:space="preserve"> Autenticación individual nominal, control RBAC y Registro d</w:t>
-      </w:r>
-      <w:r>
-        <w:rPr>
-          <w:sz w:val="19"/>
-        </w:rPr>
-        <w:t>e Actividades de Tratamiento de Datos Personales (Ley N° 29733). Razón: 520 trabajadores eventuales sin registro formal.</w:t>
+        <w:t xml:space="preserve"> Autenticación individual nominal, control RBAC y Registro de Actividades de Tratamiento de Datos Personales (Ley N° 29733). Razón: 520 trabajadores eventuales sin registro formal.</w:t>
       </w:r>
     </w:p>
     <w:p>
@@ -3470,13 +3109,7 @@
         <w:rPr>
           <w:sz w:val="19"/>
         </w:rPr>
-        <w:t xml:space="preserve"> Priorización de módulos comerciales del ERP con soporte ofici</w:t>
-      </w:r>
-      <w:r>
-        <w:rPr>
-          <w:sz w:val="19"/>
-        </w:rPr>
-        <w:t>al. Razón: el sistema crítico de trazabilidad descansaba en un Access 2014 artesanal sin soporte desde hace una década.</w:t>
+        <w:t xml:space="preserve"> Priorización de módulos comerciales del ERP con soporte oficial. Razón: el sistema crítico de trazabilidad descansaba en un Access 2014 artesanal sin soporte desde hace una década.</w:t>
       </w:r>
     </w:p>
     <w:p>
@@ -3484,11 +3117,11 @@
         <w:pStyle w:val="Ttulo2"/>
         <w:spacing w:after="80"/>
       </w:pPr>
-      <w:bookmarkStart w:id="12" w:name="_Toc242980120"/>
+      <w:bookmarkStart w:id="11" w:name="_Toc242980539"/>
       <w:r>
         <w:t>Paso B — Modelar la arquitectura actual (As-Is)</w:t>
       </w:r>
-      <w:bookmarkEnd w:id="12"/>
+      <w:bookmarkEnd w:id="11"/>
     </w:p>
     <w:p>
       <w:pPr>
@@ -3507,13 +3140,7 @@
         <w:rPr>
           <w:color w:val="000000"/>
         </w:rPr>
-        <w:t>Modelar integralmente la situación tecnológica actual de Agroexportado</w:t>
-      </w:r>
-      <w:r>
-        <w:rPr>
-          <w:color w:val="000000"/>
-        </w:rPr>
-        <w:t>ra Valle Viejo S.A.C. en sus tres capas (Negocio, Aplicación y Tecnología), evidenciando las hojas de cálculo operativas, la estructura de la información y la matriz de cooperación proceso-aplicación.</w:t>
+        <w:t>Modelar integralmente la situación tecnológica actual de Agroexportadora Valle Viejo S.A.C. en sus tres capas (Negocio, Aplicación y Tecnología), evidenciando las hojas de cálculo operativas, la estructura de la información y la matriz de cooperación proceso-aplicación.</w:t>
       </w:r>
     </w:p>
     <w:p>
@@ -3521,6 +3148,9 @@
         <w:pStyle w:val="Compact"/>
         <w:spacing w:after="60" w:line="276" w:lineRule="auto"/>
         <w:ind w:left="360"/>
+        <w:rPr>
+          <w:lang w:val="en-US"/>
+        </w:rPr>
       </w:pPr>
       <w:r>
         <w:rPr>
@@ -3533,19 +3163,14 @@
         <w:rPr>
           <w:color w:val="000000"/>
         </w:rPr>
-        <w:t>Análisis del inventario 'arquitectu</w:t>
-      </w:r>
-      <w:r>
-        <w:rPr>
-          <w:color w:val="000000"/>
-        </w:rPr>
-        <w:t>ra-actual.md', estructuración de '05_arquitectura/AR02_entidades.csv' y modelado del archivo formal ArchiMate 'anexos/anexo_A_modelo_arquitectura.archimate'. Enlace: https://github.com/GianfrancoArocutipa/Taller10_Empresa_01_Exportadora/tree/taller-10/05_a</w:t>
-      </w:r>
-      <w:r>
-        <w:rPr>
-          <w:color w:val="000000"/>
-        </w:rPr>
-        <w:t>rquitectura/AR02_entidades.csv</w:t>
+        <w:t xml:space="preserve">Análisis del inventario 'arquitectura-actual.md', estructuración de '05_arquitectura/AR02_entidades.csv' y modelado del archivo formal ArchiMate 'anexos/anexo_A_modelo_arquitectura.archimate'. </w:t>
+      </w:r>
+      <w:r>
+        <w:rPr>
+          <w:color w:val="000000"/>
+          <w:lang w:val="en-US"/>
+        </w:rPr>
+        <w:t>Enlace: https://github.com/GianfrancoArocutipa/Taller10_Empresa_01_Exportadora/tree/taller-10/05_arquitectura/AR02_entidades.csv</w:t>
       </w:r>
     </w:p>
     <w:p>
@@ -3584,13 +3209,7 @@
         <w:rPr>
           <w:color w:val="000000"/>
         </w:rPr>
-        <w:t xml:space="preserve">• Capa de Negocio: Se modelaron los 6 procesos de la cadena de valor (Recepción y pesaje, Proceso y envasado, </w:t>
-      </w:r>
-      <w:r>
-        <w:rPr>
-          <w:color w:val="000000"/>
-        </w:rPr>
-        <w:t>Control de calidad y trazabilidad, Exportación, Compras a productores y Gestión de riego), los actores (Productores, Operarios, Responsable de calidad, SENASA) y servicios de negocio.</w:t>
+        <w:t>• Capa de Negocio: Se modelaron los 6 procesos de la cadena de valor (Recepción y pesaje, Proceso y envasado, Control de calidad y trazabilidad, Exportación, Compras a productores y Gestión de riego), los actores (Productores, Operarios, Responsable de calidad, SENASA) y servicios de negocio.</w:t>
       </w:r>
     </w:p>
     <w:p>
@@ -3609,19 +3228,7 @@
         <w:rPr>
           <w:color w:val="000000"/>
         </w:rPr>
-        <w:t xml:space="preserve">• Capa de Aplicación: Se modelaron los sistemas </w:t>
-      </w:r>
-      <w:r>
-        <w:rPr>
-          <w:color w:val="000000"/>
-        </w:rPr>
-        <w:t>formales (ERP comercial, Access 2014 sin soporte, software de balanza, consola web de riego y SaaS de planillas). Siguiendo las directrices del taller, se modelaron obligatoriamente como componentes de aplicación las 3 hojas de cálculo críticas: 1) Trazabi</w:t>
-      </w:r>
-      <w:r>
-        <w:rPr>
-          <w:color w:val="000000"/>
-        </w:rPr>
-        <w:t>lidad por lote (Excel de campaña en planta), 2) Costo por tonelada (Excel de Finanzas), y 3) Programación de riego (Excel de campo). Omitirlas hubiera producido un modelo ficticio.</w:t>
+        <w:t>• Capa de Aplicación: Se modelaron los sistemas formales (ERP comercial, Access 2014 sin soporte, software de balanza, consola web de riego y SaaS de planillas). Siguiendo las directrices del taller, se modelaron obligatoriamente como componentes de aplicación las 3 hojas de cálculo críticas: 1) Trazabilidad por lote (Excel de campaña en planta), 2) Costo por tonelada (Excel de Finanzas), y 3) Programación de riego (Excel de campo). Omitirlas hubiera producido un modelo ficticio.</w:t>
       </w:r>
     </w:p>
     <w:p>
@@ -3640,13 +3247,7 @@
         <w:rPr>
           <w:color w:val="000000"/>
         </w:rPr>
-        <w:t>• Capa de Tecnología: Se modeló el servidor único o</w:t>
-      </w:r>
-      <w:r>
-        <w:rPr>
-          <w:color w:val="000000"/>
-        </w:rPr>
-        <w:t>n-premise del ERP (con UPS de solo 10 min), la PC de balanza sin conexión de red, la PC de planta en ambiente corrosivo, la red LAN plana de oficina sin segmentación y el enlace inalámbrico monoproveedor.</w:t>
+        <w:t>• Capa de Tecnología: Se modeló el servidor único on-premise del ERP (con UPS de solo 10 min), la PC de balanza sin conexión de red, la PC de planta en ambiente corrosivo, la red LAN plana de oficina sin segmentación y el enlace inalámbrico monoproveedor.</w:t>
       </w:r>
     </w:p>
     <w:p>
@@ -3665,13 +3266,7 @@
         <w:rPr>
           <w:color w:val="000000"/>
         </w:rPr>
-        <w:t>La sig</w:t>
-      </w:r>
-      <w:r>
-        <w:rPr>
-          <w:color w:val="000000"/>
-        </w:rPr>
-        <w:t>uiente matriz evalúa la cobertura de los sistemas frente a los procesos de negocio:</w:t>
+        <w:t>La siguiente matriz evalúa la cobertura de los sistemas frente a los procesos de negocio:</w:t>
       </w:r>
     </w:p>
     <w:tbl>
@@ -3854,23 +3449,7 @@
                 <w:color w:val="000000"/>
                 <w:sz w:val="17"/>
               </w:rPr>
-              <w:t>✗</w:t>
-            </w:r>
-            <w:r>
-              <w:rPr>
-                <w:b/>
-                <w:color w:val="000000"/>
-                <w:sz w:val="17"/>
-              </w:rPr>
-              <w:t xml:space="preserve"> </w:t>
-            </w:r>
-            <w:r>
-              <w:rPr>
-                <w:b/>
-                <w:color w:val="000000"/>
-                <w:sz w:val="17"/>
-              </w:rPr>
-              <w:t>Deficiente</w:t>
+              <w:t>✗ Deficiente</w:t>
             </w:r>
           </w:p>
         </w:tc>
@@ -3957,15 +3536,7 @@
                 <w:color w:val="000000"/>
                 <w:sz w:val="17"/>
               </w:rPr>
-              <w:t>✗</w:t>
-            </w:r>
-            <w:r>
-              <w:rPr>
-                <w:b/>
-                <w:color w:val="000000"/>
-                <w:sz w:val="17"/>
-              </w:rPr>
-              <w:t xml:space="preserve"> Deficiente</w:t>
+              <w:t>✗ Deficiente</w:t>
             </w:r>
           </w:p>
         </w:tc>
@@ -4012,64 +3583,48 @@
                 <w:sz w:val="17"/>
               </w:rPr>
               <w:lastRenderedPageBreak/>
-              <w:t xml:space="preserve">Control de calidad </w:t>
-            </w:r>
+              <w:t>Control de calidad y trazabilidad</w:t>
+            </w:r>
+          </w:p>
+        </w:tc>
+        <w:tc>
+          <w:tcPr>
+            <w:tcW w:w="3168" w:type="dxa"/>
+            <w:tcMar>
+              <w:top w:w="60" w:type="dxa"/>
+              <w:left w:w="80" w:type="dxa"/>
+              <w:bottom w:w="60" w:type="dxa"/>
+              <w:right w:w="80" w:type="dxa"/>
+            </w:tcMar>
+          </w:tcPr>
+          <w:p>
+            <w:r>
+              <w:rPr>
+                <w:color w:val="000000"/>
+                <w:sz w:val="17"/>
+              </w:rPr>
+              <w:t>Access 2014 + Hoja de cálculo de campaña en planta</w:t>
+            </w:r>
+          </w:p>
+        </w:tc>
+        <w:tc>
+          <w:tcPr>
+            <w:tcW w:w="1296" w:type="dxa"/>
+            <w:tcMar>
+              <w:top w:w="60" w:type="dxa"/>
+              <w:left w:w="80" w:type="dxa"/>
+              <w:bottom w:w="60" w:type="dxa"/>
+              <w:right w:w="80" w:type="dxa"/>
+            </w:tcMar>
+          </w:tcPr>
+          <w:p>
             <w:r>
               <w:rPr>
                 <w:b/>
                 <w:color w:val="000000"/>
                 <w:sz w:val="17"/>
               </w:rPr>
-              <w:t>y trazabilidad</w:t>
-            </w:r>
-          </w:p>
-        </w:tc>
-        <w:tc>
-          <w:tcPr>
-            <w:tcW w:w="3168" w:type="dxa"/>
-            <w:tcMar>
-              <w:top w:w="60" w:type="dxa"/>
-              <w:left w:w="80" w:type="dxa"/>
-              <w:bottom w:w="60" w:type="dxa"/>
-              <w:right w:w="80" w:type="dxa"/>
-            </w:tcMar>
-          </w:tcPr>
-          <w:p>
-            <w:r>
-              <w:rPr>
-                <w:color w:val="000000"/>
-                <w:sz w:val="17"/>
-              </w:rPr>
-              <w:t>Access 2014 + Hoja de cálculo de campaña en planta</w:t>
-            </w:r>
-          </w:p>
-        </w:tc>
-        <w:tc>
-          <w:tcPr>
-            <w:tcW w:w="1296" w:type="dxa"/>
-            <w:tcMar>
-              <w:top w:w="60" w:type="dxa"/>
-              <w:left w:w="80" w:type="dxa"/>
-              <w:bottom w:w="60" w:type="dxa"/>
-              <w:right w:w="80" w:type="dxa"/>
-            </w:tcMar>
-          </w:tcPr>
-          <w:p>
-            <w:r>
-              <w:rPr>
-                <w:b/>
-                <w:color w:val="000000"/>
-                <w:sz w:val="17"/>
-              </w:rPr>
-              <w:t>✗</w:t>
-            </w:r>
-            <w:r>
-              <w:rPr>
-                <w:b/>
-                <w:color w:val="000000"/>
-                <w:sz w:val="17"/>
-              </w:rPr>
-              <w:t xml:space="preserve"> Deficiente</w:t>
+              <w:t>✗ Deficiente</w:t>
             </w:r>
           </w:p>
         </w:tc>
@@ -4176,14 +3731,7 @@
                 <w:color w:val="000000"/>
                 <w:sz w:val="17"/>
               </w:rPr>
-              <w:t>No valida lotes en tiempo</w:t>
-            </w:r>
-            <w:r>
-              <w:rPr>
-                <w:color w:val="000000"/>
-                <w:sz w:val="17"/>
-              </w:rPr>
-              <w:t xml:space="preserve"> real; acuerdos en correos.</w:t>
+              <w:t>No valida lotes en tiempo real; acuerdos en correos.</w:t>
             </w:r>
           </w:p>
         </w:tc>
@@ -4337,15 +3885,7 @@
                 <w:color w:val="000000"/>
                 <w:sz w:val="17"/>
               </w:rPr>
-              <w:t>~</w:t>
-            </w:r>
-            <w:r>
-              <w:rPr>
-                <w:b/>
-                <w:color w:val="000000"/>
-                <w:sz w:val="17"/>
-              </w:rPr>
-              <w:t xml:space="preserve"> Parcial</w:t>
+              <w:t>~ Parcial</w:t>
             </w:r>
           </w:p>
         </w:tc>
@@ -4396,7 +3936,7 @@
           <w:color w:val="16285C"/>
           <w:sz w:val="20"/>
         </w:rPr>
-        <w:t>Evidencia en GitHub · Vista de Cooperación Pr</w:t>
+        <w:t>Evidencia en GitHub · Vista de Cooperación Proceso-Aplicación (As-Is):</w:t>
       </w:r>
       <w:r>
         <w:rPr>
@@ -4404,14 +3944,6 @@
           <w:color w:val="16285C"/>
           <w:sz w:val="20"/>
         </w:rPr>
-        <w:t>oceso-Aplicación (As-Is):</w:t>
-      </w:r>
-      <w:r>
-        <w:rPr>
-          <w:b/>
-          <w:color w:val="16285C"/>
-          <w:sz w:val="20"/>
-        </w:rPr>
         <w:br/>
       </w:r>
       <w:r>
@@ -4448,15 +3980,7 @@
           <w:color w:val="323232"/>
           <w:sz w:val="19"/>
         </w:rPr>
-        <w:t>• Descri</w:t>
-      </w:r>
-      <w:r>
-        <w:rPr>
-          <w:i/>
-          <w:color w:val="323232"/>
-          <w:sz w:val="19"/>
-        </w:rPr>
-        <w:t>pción: Matriz visual de evaluación de cobertura que evidencia 3 procesos en estado Deficiente (50%) y 3 en estado Parcial (50%). Conforme a las directrices de la guía, la evidencia visual se verifica en el enlace oficial del repositorio (Anexo B).</w:t>
+        <w:t>• Descripción: Matriz visual de evaluación de cobertura que evidencia 3 procesos en estado Deficiente (50%) y 3 en estado Parcial (50%). Conforme a las directrices de la guía, la evidencia visual se verifica en el enlace oficial del repositorio (Anexo B).</w:t>
       </w:r>
     </w:p>
     <w:p>
@@ -5219,15 +4743,7 @@
                 <w:color w:val="000000"/>
                 <w:sz w:val="16"/>
               </w:rPr>
-              <w:t xml:space="preserve">Cliente </w:t>
-            </w:r>
-            <w:r>
-              <w:rPr>
-                <w:b/>
-                <w:color w:val="000000"/>
-                <w:sz w:val="16"/>
-              </w:rPr>
-              <w:t>ext.</w:t>
+              <w:t>Cliente ext.</w:t>
             </w:r>
           </w:p>
         </w:tc>
@@ -5493,14 +5009,7 @@
                 <w:color w:val="000000"/>
                 <w:sz w:val="16"/>
               </w:rPr>
-              <w:t xml:space="preserve">650 pesajes de </w:t>
-            </w:r>
-            <w:r>
-              <w:rPr>
-                <w:color w:val="000000"/>
-                <w:sz w:val="16"/>
-              </w:rPr>
-              <w:t>balanza sin transcripción a ERP.</w:t>
+              <w:t>650 pesajes de balanza sin transcripción a ERP.</w:t>
             </w:r>
           </w:p>
         </w:tc>
@@ -5781,14 +5290,7 @@
                 <w:sz w:val="16"/>
               </w:rPr>
               <w:lastRenderedPageBreak/>
-              <w:t xml:space="preserve">48 sectores / 1 </w:t>
-            </w:r>
-            <w:r>
-              <w:rPr>
-                <w:color w:val="000000"/>
-                <w:sz w:val="16"/>
-              </w:rPr>
-              <w:t>libro</w:t>
+              <w:t>48 sectores / 1 libro</w:t>
             </w:r>
           </w:p>
         </w:tc>
@@ -5913,14 +5415,7 @@
           <w:i/>
           <w:color w:val="000000"/>
         </w:rPr>
-        <w:t>Métricas clave de la capa de datos: 5 de 7 entidades (71.4%) carecen de fuente autoritativa única y 5 de 7 entidades (71.4%) no tienen un dueño asignado formalmente por</w:t>
-      </w:r>
-      <w:r>
-        <w:rPr>
-          <w:i/>
-          <w:color w:val="000000"/>
-        </w:rPr>
-        <w:t xml:space="preserve"> cargo. Asimismo, el 100% de los datos personales de trabajadores de campaña se manejan de manera informal sin medidas de la Ley N° 29733.</w:t>
+        <w:t>Métricas clave de la capa de datos: 5 de 7 entidades (71.4%) carecen de fuente autoritativa única y 5 de 7 entidades (71.4%) no tienen un dueño asignado formalmente por cargo. Asimismo, el 100% de los datos personales de trabajadores de campaña se manejan de manera informal sin medidas de la Ley N° 29733.</w:t>
       </w:r>
     </w:p>
     <w:p>
@@ -5950,14 +5445,7 @@
           <w:color w:val="000000"/>
           <w:sz w:val="19"/>
         </w:rPr>
-        <w:t xml:space="preserve">• Archivo: </w:t>
-      </w:r>
-      <w:r>
-        <w:rPr>
-          <w:color w:val="000000"/>
-          <w:sz w:val="19"/>
-        </w:rPr>
-        <w:t>docs/evidencias/S10/graficos/vista_actual_3capas.png</w:t>
+        <w:t>• Archivo: docs/evidencias/S10/graficos/vista_actual_3capas.png</w:t>
       </w:r>
       <w:r>
         <w:rPr>
@@ -5986,15 +5474,7 @@
           <w:color w:val="323232"/>
           <w:sz w:val="19"/>
         </w:rPr>
-        <w:t>• Descripción: Modelo completo en ArchiMa</w:t>
-      </w:r>
-      <w:r>
-        <w:rPr>
-          <w:i/>
-          <w:color w:val="323232"/>
-          <w:sz w:val="19"/>
-        </w:rPr>
-        <w:t>te 3.2 que formaliza en la capa de aplicación los tres libros de hojas de cálculo operativos (Trazabilidad, Costo/Tn y Riego), el Access 2014 sin soporte y la infraestructura física. Archivo nativo Archi: anexos/anexo_A_modelo_arquitectura.archimate</w:t>
+        <w:t>• Descripción: Modelo completo en ArchiMate 3.2 que formaliza en la capa de aplicación los tres libros de hojas de cálculo operativos (Trazabilidad, Costo/Tn y Riego), el Access 2014 sin soporte y la infraestructura física. Archivo nativo Archi: anexos/anexo_A_modelo_arquitectura.archimate</w:t>
       </w:r>
     </w:p>
     <w:p>
@@ -6002,14 +5482,11 @@
         <w:pStyle w:val="Ttulo2"/>
         <w:spacing w:after="80"/>
       </w:pPr>
-      <w:bookmarkStart w:id="13" w:name="_Toc242980121"/>
-      <w:r>
-        <w:t>Paso C</w:t>
-      </w:r>
-      <w:r>
-        <w:t xml:space="preserve"> — Modelar la arquitectura objetivo (To-Be)</w:t>
-      </w:r>
-      <w:bookmarkEnd w:id="13"/>
+      <w:bookmarkStart w:id="12" w:name="_Toc242980540"/>
+      <w:r>
+        <w:t>Paso C — Modelar la arquitectura objetivo (To-Be)</w:t>
+      </w:r>
+      <w:bookmarkEnd w:id="12"/>
     </w:p>
     <w:p>
       <w:pPr>
@@ -6042,14 +5519,7 @@
           <w:b/>
           <w:color w:val="000000"/>
         </w:rPr>
-        <w:t xml:space="preserve">• </w:t>
-      </w:r>
-      <w:r>
-        <w:rPr>
-          <w:b/>
-          <w:color w:val="000000"/>
-        </w:rPr>
-        <w:t xml:space="preserve">Comando o acción: </w:t>
+        <w:t xml:space="preserve">• Comando o acción: </w:t>
       </w:r>
       <w:r>
         <w:rPr>
@@ -6088,26 +5558,13 @@
           <w:b/>
           <w:color w:val="000000"/>
         </w:rPr>
-        <w:t>C.1 Der</w:t>
-      </w:r>
-      <w:r>
-        <w:rPr>
-          <w:b/>
-          <w:color w:val="000000"/>
-        </w:rPr>
-        <w:t xml:space="preserve">ivación: </w:t>
-      </w:r>
-      <w:r>
-        <w:rPr>
-          <w:color w:val="000000"/>
-        </w:rPr>
-        <w:t>• Derivación Estratégica: El objetivo declarado de 'reducir el cierre de trazabilidad de 11 días a menos de 2 horas' exige reemplazar el Access 2014 y las hojas de cálculo por un Módulo de Trazabilidad y Producción (MES) integrado nativamente al E</w:t>
-      </w:r>
-      <w:r>
-        <w:rPr>
-          <w:color w:val="000000"/>
-        </w:rPr>
-        <w:t>RP. La exigencia de inocuidad SENASA y la Ley 29733 imponen la digitalización del padrón de productores y el registro de trabajadores.</w:t>
+        <w:t xml:space="preserve">C.1 Derivación: </w:t>
+      </w:r>
+      <w:r>
+        <w:rPr>
+          <w:color w:val="000000"/>
+        </w:rPr>
+        <w:t>• Derivación Estratégica: El objetivo declarado de 'reducir el cierre de trazabilidad de 11 días a menos de 2 horas' exige reemplazar el Access 2014 y las hojas de cálculo por un Módulo de Trazabilidad y Producción (MES) integrado nativamente al ERP. La exigencia de inocuidad SENASA y la Ley 29733 imponen la digitalización del padrón de productores y el registro de trabajadores.</w:t>
       </w:r>
     </w:p>
     <w:tbl>
@@ -6289,14 +5746,7 @@
                 <w:color w:val="000000"/>
                 <w:sz w:val="17"/>
               </w:rPr>
-              <w:t>Rece</w:t>
-            </w:r>
-            <w:r>
-              <w:rPr>
-                <w:color w:val="000000"/>
-                <w:sz w:val="17"/>
-              </w:rPr>
-              <w:t>pción y pesaje automatizado con sensores IoT y escáner</w:t>
+              <w:t>Recepción y pesaje automatizado con sensores IoT y escáner</w:t>
             </w:r>
           </w:p>
         </w:tc>
@@ -6448,14 +5898,7 @@
                 <w:color w:val="000000"/>
                 <w:sz w:val="17"/>
               </w:rPr>
-              <w:t xml:space="preserve">Lote en 4 sistemas </w:t>
-            </w:r>
-            <w:r>
-              <w:rPr>
-                <w:color w:val="000000"/>
-                <w:sz w:val="17"/>
-              </w:rPr>
-              <w:t>disjuntos (6% desvío)</w:t>
+              <w:t>Lote en 4 sistemas disjuntos (6% desvío)</w:t>
             </w:r>
           </w:p>
         </w:tc>
@@ -6753,14 +6196,7 @@
                 <w:color w:val="000000"/>
                 <w:sz w:val="17"/>
               </w:rPr>
-              <w:t xml:space="preserve">Principio 6 </w:t>
-            </w:r>
-            <w:r>
-              <w:rPr>
-                <w:color w:val="000000"/>
-                <w:sz w:val="17"/>
-              </w:rPr>
-              <w:t>e Incidente 2024</w:t>
+              <w:t>Principio 6 e Incidente 2024</w:t>
             </w:r>
           </w:p>
         </w:tc>
@@ -6913,14 +6349,7 @@
                 <w:color w:val="000000"/>
                 <w:sz w:val="17"/>
               </w:rPr>
-              <w:t xml:space="preserve">Módulo de costeo estándar automático en </w:t>
-            </w:r>
-            <w:r>
-              <w:rPr>
-                <w:color w:val="000000"/>
-                <w:sz w:val="17"/>
-              </w:rPr>
-              <w:t>ERP contable</w:t>
+              <w:t>Módulo de costeo estándar automático en ERP contable</w:t>
             </w:r>
           </w:p>
         </w:tc>
@@ -7092,14 +6521,7 @@
                 <w:color w:val="000000"/>
                 <w:sz w:val="17"/>
               </w:rPr>
-              <w:t xml:space="preserve">Infraestructura híbrida con </w:t>
-            </w:r>
-            <w:r>
-              <w:rPr>
-                <w:color w:val="000000"/>
-                <w:sz w:val="17"/>
-              </w:rPr>
-              <w:t>RAID y réplica inmutable en nube</w:t>
+              <w:t>Infraestructura híbrida con RAID y réplica inmutable en nube</w:t>
             </w:r>
           </w:p>
         </w:tc>
@@ -7271,14 +6693,7 @@
                 <w:color w:val="000000"/>
                 <w:sz w:val="17"/>
               </w:rPr>
-              <w:t>VLANs segmentadas (P</w:t>
-            </w:r>
-            <w:r>
-              <w:rPr>
-                <w:color w:val="000000"/>
-                <w:sz w:val="17"/>
-              </w:rPr>
-              <w:t>lanta/Oficina/DMZ) y enlace redundante</w:t>
+              <w:t>VLANs segmentadas (Planta/Oficina/DMZ) y enlace redundante</w:t>
             </w:r>
           </w:p>
         </w:tc>
@@ -7345,14 +6760,7 @@
           <w:color w:val="003399"/>
           <w:sz w:val="19"/>
         </w:rPr>
-        <w:t>• URL de verificación: https://github.com/Gia</w:t>
-      </w:r>
-      <w:r>
-        <w:rPr>
-          <w:color w:val="003399"/>
-          <w:sz w:val="19"/>
-        </w:rPr>
-        <w:t>nfrancoArocutipa/Taller10_Empresa_01_Exportadora/tree/taller-10/docs/evidencias/S10/graficos/vista_objetivo.png</w:t>
+        <w:t>• URL de verificación: https://github.com/GianfrancoArocutipa/Taller10_Empresa_01_Exportadora/tree/taller-10/docs/evidencias/S10/graficos/vista_objetivo.png</w:t>
       </w:r>
       <w:r>
         <w:rPr>
@@ -7367,15 +6775,7 @@
           <w:color w:val="323232"/>
           <w:sz w:val="19"/>
         </w:rPr>
-        <w:t>• Descripción: Modelo objetivo que representa la modernización integral: Módulo MES de Trazabilidad, Capa de integración de servicios (APIs REST</w:t>
-      </w:r>
-      <w:r>
-        <w:rPr>
-          <w:i/>
-          <w:color w:val="323232"/>
-          <w:sz w:val="19"/>
-        </w:rPr>
-        <w:t>), conectividad IoT en balanza de ingreso y alta disponibilidad en nube híbrida con respaldo inmutable (Anexo D).</w:t>
+        <w:t>• Descripción: Modelo objetivo que representa la modernización integral: Módulo MES de Trazabilidad, Capa de integración de servicios (APIs REST), conectividad IoT en balanza de ingreso y alta disponibilidad en nube híbrida con respaldo inmutable (Anexo D).</w:t>
       </w:r>
     </w:p>
     <w:p>
@@ -7383,11 +6783,11 @@
         <w:pStyle w:val="Ttulo2"/>
         <w:spacing w:after="80"/>
       </w:pPr>
-      <w:bookmarkStart w:id="14" w:name="_Toc242980122"/>
+      <w:bookmarkStart w:id="13" w:name="_Toc242980541"/>
       <w:r>
         <w:t>Paso D — Análisis de brechas y paquetes de trabajo</w:t>
       </w:r>
-      <w:bookmarkEnd w:id="14"/>
+      <w:bookmarkEnd w:id="13"/>
     </w:p>
     <w:p>
       <w:pPr>
@@ -7406,13 +6806,7 @@
         <w:rPr>
           <w:color w:val="000000"/>
         </w:rPr>
-        <w:t>Identificar la totalidad de brechas entre el estado actual y el objetivo,</w:t>
-      </w:r>
-      <w:r>
-        <w:rPr>
-          <w:color w:val="000000"/>
-        </w:rPr>
-        <w:t xml:space="preserve"> clasificarlas por capa y tipo, calcular el esfuerzo técnico y derivar los paquetes de trabajo respetando su secuencia lógica obligada.</w:t>
+        <w:t>Identificar la totalidad de brechas entre el estado actual y el objetivo, clasificarlas por capa y tipo, calcular el esfuerzo técnico y derivar los paquetes de trabajo respetando su secuencia lógica obligada.</w:t>
       </w:r>
     </w:p>
     <w:p>
@@ -7420,6 +6814,9 @@
         <w:pStyle w:val="Compact"/>
         <w:spacing w:after="60" w:line="276" w:lineRule="auto"/>
         <w:ind w:left="360"/>
+        <w:rPr>
+          <w:lang w:val="en-US"/>
+        </w:rPr>
       </w:pPr>
       <w:r>
         <w:rPr>
@@ -7432,13 +6829,14 @@
         <w:rPr>
           <w:color w:val="000000"/>
         </w:rPr>
-        <w:t xml:space="preserve">Ejecución automatizada del script en Python '05_arquitectura/AR03_brechas.py', generando el dataset </w:t>
-      </w:r>
-      <w:r>
-        <w:rPr>
-          <w:color w:val="000000"/>
-        </w:rPr>
-        <w:t>'05_arquitectura/AR03_brechas.csv' y el registro en 'docs/evidencias/S10/salidas/salida_brechas.txt'. Enlace: https://github.com/GianfrancoArocutipa/Taller10_Empresa_01_Exportadora/tree/taller-10/05_arquitectura/AR03_brechas.py</w:t>
+        <w:t xml:space="preserve">Ejecución automatizada del script en Python '05_arquitectura/AR03_brechas.py', generando el dataset '05_arquitectura/AR03_brechas.csv' y el registro en 'docs/evidencias/S10/salidas/salida_brechas.txt'. </w:t>
+      </w:r>
+      <w:r>
+        <w:rPr>
+          <w:color w:val="000000"/>
+          <w:lang w:val="en-US"/>
+        </w:rPr>
+        <w:t>Enlace: https://github.com/GianfrancoArocutipa/Taller10_Empresa_01_Exportadora/tree/taller-10/05_arquitectura/AR03_brechas.py</w:t>
       </w:r>
     </w:p>
     <w:p>
@@ -7452,14 +6850,7 @@
           <w:b/>
           <w:color w:val="000000"/>
         </w:rPr>
-        <w:t>• Evidencia de que funcionó:</w:t>
-      </w:r>
-      <w:r>
-        <w:rPr>
-          <w:b/>
-          <w:color w:val="000000"/>
-        </w:rPr>
-        <w:t xml:space="preserve"> </w:t>
+        <w:t xml:space="preserve">• Evidencia de que funcionó: </w:t>
       </w:r>
       <w:r>
         <w:rPr>
@@ -7699,14 +7090,7 @@
                 <w:color w:val="000000"/>
                 <w:sz w:val="17"/>
               </w:rPr>
-              <w:t xml:space="preserve">Lote disperso en 4 sistemas; 32 </w:t>
-            </w:r>
-            <w:r>
-              <w:rPr>
-                <w:color w:val="000000"/>
-                <w:sz w:val="17"/>
-              </w:rPr>
-              <w:t>productores fuera de ERP; 520 trabajadores sin registro.</w:t>
+              <w:t>Lote disperso en 4 sistemas; 32 productores fuera de ERP; 520 trabajadores sin registro.</w:t>
             </w:r>
           </w:p>
         </w:tc>
@@ -8084,14 +7468,7 @@
                 <w:color w:val="000000"/>
                 <w:sz w:val="17"/>
               </w:rPr>
-              <w:t>Servidor único con UPS 10 min; Red plana y enlace monop</w:t>
-            </w:r>
-            <w:r>
-              <w:rPr>
-                <w:color w:val="000000"/>
-                <w:sz w:val="17"/>
-              </w:rPr>
-              <w:t>roveedor.</w:t>
+              <w:t>Servidor único con UPS 10 min; Red plana y enlace monoproveedor.</w:t>
             </w:r>
           </w:p>
         </w:tc>
@@ -8344,14 +7721,7 @@
                 <w:color w:val="000000"/>
                 <w:sz w:val="17"/>
               </w:rPr>
-              <w:t xml:space="preserve">Sin </w:t>
-            </w:r>
-            <w:r>
-              <w:rPr>
-                <w:color w:val="000000"/>
-                <w:sz w:val="17"/>
-              </w:rPr>
-              <w:t>Comité de TI ni políticas formalizadas; Cuentas de admin compartidas.</w:t>
+              <w:t>Sin Comité de TI ni políticas formalizadas; Cuentas de admin compartidas.</w:t>
             </w:r>
           </w:p>
         </w:tc>
@@ -8433,13 +7803,7 @@
         <w:rPr>
           <w:color w:val="000000"/>
         </w:rPr>
-        <w:t xml:space="preserve">Secuencia obligada determinada: La Fase 1 (PT-01, PT-04 y PT-06) constituye la base habilitadora obligatoria. La Fase 2 </w:t>
-      </w:r>
-      <w:r>
-        <w:rPr>
-          <w:color w:val="000000"/>
-        </w:rPr>
-        <w:t>(PT-02 y PT-03) no puede iniciar sin datos maestros saneados ni redes industriales operativas. Finalmente, la Fase 3 (PT-05) optimiza los costos una vez que la trazabilidad en planta está estabilizada.</w:t>
+        <w:t>Secuencia obligada determinada: La Fase 1 (PT-01, PT-04 y PT-06) constituye la base habilitadora obligatoria. La Fase 2 (PT-02 y PT-03) no puede iniciar sin datos maestros saneados ni redes industriales operativas. Finalmente, la Fase 3 (PT-05) optimiza los costos una vez que la trazabilidad en planta está estabilizada.</w:t>
       </w:r>
     </w:p>
     <w:p>
@@ -8447,11 +7811,11 @@
         <w:pStyle w:val="Ttulo2"/>
         <w:spacing w:after="80"/>
       </w:pPr>
-      <w:bookmarkStart w:id="15" w:name="_Toc242980123"/>
+      <w:bookmarkStart w:id="14" w:name="_Toc242980542"/>
       <w:r>
         <w:t>Paso E — Vistas y redacción de la Sección 5 del PETI</w:t>
       </w:r>
-      <w:bookmarkEnd w:id="15"/>
+      <w:bookmarkEnd w:id="14"/>
     </w:p>
     <w:p>
       <w:pPr>
@@ -8464,14 +7828,7 @@
           <w:b/>
           <w:color w:val="000000"/>
         </w:rPr>
-        <w:t>•</w:t>
-      </w:r>
-      <w:r>
-        <w:rPr>
-          <w:b/>
-          <w:color w:val="000000"/>
-        </w:rPr>
-        <w:t xml:space="preserve"> Qué se buscaba: </w:t>
+        <w:t xml:space="preserve">• Qué se buscaba: </w:t>
       </w:r>
       <w:r>
         <w:rPr>
@@ -8485,6 +7842,9 @@
         <w:pStyle w:val="Compact"/>
         <w:spacing w:after="60" w:line="276" w:lineRule="auto"/>
         <w:ind w:left="360"/>
+        <w:rPr>
+          <w:lang w:val="en-US"/>
+        </w:rPr>
       </w:pPr>
       <w:r>
         <w:rPr>
@@ -8497,13 +7857,14 @@
         <w:rPr>
           <w:color w:val="000000"/>
         </w:rPr>
-        <w:t xml:space="preserve">Redacción completa de 'docs/05_seccion_arquitectura.md' </w:t>
-      </w:r>
-      <w:r>
-        <w:rPr>
-          <w:color w:val="000000"/>
-        </w:rPr>
-        <w:t>estructurada en cuatro subsecciones: 5.1 Principios, 5.2 Arquitectura actual, 5.3 Arquitectura objetivo y 5.4 Análisis de brechas. Enlace: https://github.com/GianfrancoArocutipa/Taller10_Empresa_01_Exportadora/tree/taller-10/docs/05_seccion_arquitectura.md</w:t>
+        <w:t xml:space="preserve">Redacción completa de 'docs/05_seccion_arquitectura.md' estructurada en cuatro subsecciones: 5.1 Principios, 5.2 Arquitectura actual, 5.3 Arquitectura objetivo y 5.4 Análisis de brechas. </w:t>
+      </w:r>
+      <w:r>
+        <w:rPr>
+          <w:color w:val="000000"/>
+          <w:lang w:val="en-US"/>
+        </w:rPr>
+        <w:t>Enlace: https://github.com/GianfrancoArocutipa/Taller10_Empresa_01_Exportadora/tree/taller-10/docs/05_seccion_arquitectura.md</w:t>
       </w:r>
     </w:p>
     <w:p>
@@ -8531,11 +7892,11 @@
         <w:pStyle w:val="Ttulo2"/>
         <w:spacing w:after="80"/>
       </w:pPr>
-      <w:bookmarkStart w:id="16" w:name="_Toc242980124"/>
+      <w:bookmarkStart w:id="15" w:name="_Toc242980543"/>
       <w:r>
         <w:t>Paso F — Validar y corregir</w:t>
       </w:r>
-      <w:bookmarkEnd w:id="16"/>
+      <w:bookmarkEnd w:id="15"/>
     </w:p>
     <w:p>
       <w:pPr>
@@ -8554,13 +7915,7 @@
         <w:rPr>
           <w:color w:val="000000"/>
         </w:rPr>
-        <w:t xml:space="preserve">Someter los artefactos producidos a las </w:t>
-      </w:r>
-      <w:r>
-        <w:rPr>
-          <w:color w:val="000000"/>
-        </w:rPr>
-        <w:t>tres comprobaciones obligatorias de calidad antes de cerrar la sesión de laboratorio, registrando el resultado en 'docs/evidencias/S10/salidas/validaciones.txt'.</w:t>
+        <w:t>Someter los artefactos producidos a las tres comprobaciones obligatorias de calidad antes de cerrar la sesión de laboratorio, registrando el resultado en 'docs/evidencias/S10/salidas/validaciones.txt'.</w:t>
       </w:r>
     </w:p>
     <w:p>
@@ -8580,13 +7935,7 @@
         <w:rPr>
           <w:color w:val="000000"/>
         </w:rPr>
-        <w:t>Auditoría cruzada del modelo ArchiMate frente al inventario real y verific</w:t>
-      </w:r>
-      <w:r>
-        <w:rPr>
-          <w:color w:val="000000"/>
-        </w:rPr>
-        <w:t>ación de relaciones bidireccionales en las brechas.</w:t>
+        <w:t>Auditoría cruzada del modelo ArchiMate frente al inventario real y verificación de relaciones bidireccionales en las brechas.</w:t>
       </w:r>
     </w:p>
     <w:p>
@@ -8626,13 +7975,7 @@
         <w:rPr>
           <w:color w:val="000000"/>
         </w:rPr>
-        <w:t>Comprobación 1 (Pertenencia de Capas en ArchiMate 3.2): Cumplida. Se verificó que los procesos y actores res</w:t>
-      </w:r>
-      <w:r>
-        <w:rPr>
-          <w:color w:val="000000"/>
-        </w:rPr>
-        <w:t>idan en Negocio, los sistemas y hojas de cálculo en Aplicación, y los nodos, redes y DBMS en Tecnología.</w:t>
+        <w:t>Comprobación 1 (Pertenencia de Capas en ArchiMate 3.2): Cumplida. Se verificó que los procesos y actores residan en Negocio, los sistemas y hojas de cálculo en Aplicación, y los nodos, redes y DBMS en Tecnología.</w:t>
       </w:r>
     </w:p>
     <w:p>
@@ -8652,13 +7995,7 @@
         <w:rPr>
           <w:color w:val="000000"/>
         </w:rPr>
-        <w:t>Comprobación 2 (Existencia Real de Aplicaciones): Cumplida. Se contrastó el modelo con el inventario oficial. No se incluyeron aplicaciones teóric</w:t>
-      </w:r>
-      <w:r>
-        <w:rPr>
-          <w:color w:val="000000"/>
-        </w:rPr>
-        <w:t>as; las 8 aplicaciones modeladas existen y operan en La Yarada.</w:t>
+        <w:t>Comprobación 2 (Existencia Real de Aplicaciones): Cumplida. Se contrastó el modelo con el inventario oficial. No se incluyeron aplicaciones teóricas; las 8 aplicaciones modeladas existen y operan en La Yarada.</w:t>
       </w:r>
     </w:p>
     <w:p>
@@ -8686,14 +8023,11 @@
         <w:pStyle w:val="Ttulo2"/>
         <w:spacing w:after="80"/>
       </w:pPr>
-      <w:bookmarkStart w:id="17" w:name="_Toc242980125"/>
-      <w:r>
-        <w:t>Paso G —</w:t>
-      </w:r>
-      <w:r>
-        <w:t xml:space="preserve"> Registrar la evidencia y cerrar</w:t>
-      </w:r>
-      <w:bookmarkEnd w:id="17"/>
+      <w:bookmarkStart w:id="16" w:name="_Toc242980544"/>
+      <w:r>
+        <w:t>Paso G — Registrar la evidencia y cerrar</w:t>
+      </w:r>
+      <w:bookmarkEnd w:id="16"/>
     </w:p>
     <w:p>
       <w:pPr>
@@ -8733,13 +8067,7 @@
         <w:rPr>
           <w:color w:val="000000"/>
         </w:rPr>
-        <w:t xml:space="preserve">Ejecución de los comandos oficiales de control de </w:t>
-      </w:r>
-      <w:r>
-        <w:rPr>
-          <w:color w:val="000000"/>
-        </w:rPr>
-        <w:t>versiones y etiquetado:</w:t>
+        <w:t>Ejecución de los comandos oficiales de control de versiones y etiquetado:</w:t>
       </w:r>
     </w:p>
     <w:p>
@@ -8789,15 +8117,7 @@
           <w:sz w:val="19"/>
         </w:rPr>
         <w:br/>
-        <w:t xml:space="preserve">git push origin main </w:t>
-      </w:r>
-      <w:r>
-        <w:rPr>
-          <w:rFonts w:ascii="Consolas" w:hAnsi="Consolas"/>
-          <w:color w:val="000000"/>
-          <w:sz w:val="19"/>
-        </w:rPr>
-        <w:t>--tags</w:t>
+        <w:t>git push origin main --tags</w:t>
       </w:r>
     </w:p>
     <w:p>
@@ -8825,11 +8145,11 @@
         <w:pStyle w:val="Ttulo1"/>
         <w:spacing w:after="120"/>
       </w:pPr>
-      <w:bookmarkStart w:id="18" w:name="_Toc242980126"/>
+      <w:bookmarkStart w:id="17" w:name="_Toc242980545"/>
       <w:r>
         <w:t>3. Resultados</w:t>
       </w:r>
-      <w:bookmarkEnd w:id="18"/>
+      <w:bookmarkEnd w:id="17"/>
     </w:p>
     <w:p>
       <w:pPr>
@@ -8840,13 +8160,7 @@
         <w:rPr>
           <w:color w:val="000000"/>
         </w:rPr>
-        <w:t xml:space="preserve">A continuación se presenta la matriz de </w:t>
-      </w:r>
-      <w:r>
-        <w:rPr>
-          <w:color w:val="000000"/>
-        </w:rPr>
-        <w:t>comprobación oficial del Taller 10, evaluada frente a los resultados esperados de la guía y respaldada por las evidencias verificables en el repositorio:</w:t>
+        <w:t>A continuación se presenta la matriz de comprobación oficial del Taller 10, evaluada frente a los resultados esperados de la guía y respaldada por las evidencias verificables en el repositorio:</w:t>
       </w:r>
     </w:p>
     <w:tbl>
@@ -9008,14 +8322,7 @@
                 <w:color w:val="000000"/>
                 <w:sz w:val="17"/>
               </w:rPr>
-              <w:t>Seis principios de arquitectura con los cinco</w:t>
-            </w:r>
-            <w:r>
-              <w:rPr>
-                <w:color w:val="000000"/>
-                <w:sz w:val="17"/>
-              </w:rPr>
-              <w:t xml:space="preserve"> campos y su trazabilidad al diagnóstico</w:t>
+              <w:t>Seis principios de arquitectura con los cinco campos y su trazabilidad al diagnóstico</w:t>
             </w:r>
           </w:p>
         </w:tc>
@@ -9143,14 +8450,7 @@
                 <w:color w:val="000000"/>
                 <w:sz w:val="17"/>
               </w:rPr>
-              <w:t>https://github</w:t>
-            </w:r>
-            <w:r>
-              <w:rPr>
-                <w:color w:val="000000"/>
-                <w:sz w:val="17"/>
-              </w:rPr>
-              <w:t>.com/GianfrancoArocutipa/Taller10_Empresa_01_Exportadora/tree/taller-10/anexos/anexo_A_modelo_arquitectura.archimate</w:t>
+              <w:t>https://github.com/GianfrancoArocutipa/Taller10_Empresa_01_Exportadora/tree/taller-10/anexos/anexo_A_modelo_arquitectura.archimate</w:t>
             </w:r>
           </w:p>
         </w:tc>
@@ -9324,14 +8624,7 @@
                 <w:color w:val="000000"/>
                 <w:sz w:val="17"/>
               </w:rPr>
-              <w:t>https://github.com/Gia</w:t>
-            </w:r>
-            <w:r>
-              <w:rPr>
-                <w:color w:val="000000"/>
-                <w:sz w:val="17"/>
-              </w:rPr>
-              <w:t>nfrancoArocutipa/Taller10_Empresa_01_Exportadora/tree/taller-10/docs/evidencias/S10/graficos/vista_cooperacion.png</w:t>
+              <w:t>https://github.com/GianfrancoArocutipa/Taller10_Empresa_01_Exportadora/tree/taller-10/docs/evidencias/S10/graficos/vista_cooperacion.png</w:t>
             </w:r>
           </w:p>
         </w:tc>
@@ -9418,14 +8711,7 @@
                 <w:color w:val="000000"/>
                 <w:sz w:val="17"/>
               </w:rPr>
-              <w:t>https://github.com/GianfrancoArocutipa/Talle</w:t>
-            </w:r>
-            <w:r>
-              <w:rPr>
-                <w:color w:val="000000"/>
-                <w:sz w:val="17"/>
-              </w:rPr>
-              <w:t>r10_Empresa_01_Exportadora/tree/taller-10/05_arquitectura/AR02_entidades.csv</w:t>
+              <w:t>https://github.com/GianfrancoArocutipa/Taller10_Empresa_01_Exportadora/tree/taller-10/05_arquitectura/AR02_entidades.csv</w:t>
             </w:r>
           </w:p>
         </w:tc>
@@ -9512,14 +8798,7 @@
                 <w:color w:val="000000"/>
                 <w:sz w:val="17"/>
               </w:rPr>
-              <w:t>5 de 7 entidades (71.4%) en https://github.com/GianfrancoArocutipa/Taller10_Empresa_01_Exportador</w:t>
-            </w:r>
-            <w:r>
-              <w:rPr>
-                <w:color w:val="000000"/>
-                <w:sz w:val="17"/>
-              </w:rPr>
-              <w:t>a/tree/taller-10/05_arquitectura/AR02_entidades.csv</w:t>
+              <w:t>5 de 7 entidades (71.4%) en https://github.com/GianfrancoArocutipa/Taller10_Empresa_01_Exportadora/tree/taller-10/05_arquitectura/AR02_entidades.csv</w:t>
             </w:r>
           </w:p>
         </w:tc>
@@ -9606,14 +8885,7 @@
                 <w:color w:val="000000"/>
                 <w:sz w:val="17"/>
               </w:rPr>
-              <w:t>3 entidades clasificadas en https://github.com/GianfrancoArocutipa/Taller10_Empresa_01_Exportadora/tree/taller-10/05_arqu</w:t>
-            </w:r>
-            <w:r>
-              <w:rPr>
-                <w:color w:val="000000"/>
-                <w:sz w:val="17"/>
-              </w:rPr>
-              <w:t>itectura/AR02_entidades.csv</w:t>
+              <w:t>3 entidades clasificadas en https://github.com/GianfrancoArocutipa/Taller10_Empresa_01_Exportadora/tree/taller-10/05_arquitectura/AR02_entidades.csv</w:t>
             </w:r>
           </w:p>
         </w:tc>
@@ -9747,14 +9019,7 @@
                 <w:color w:val="000000"/>
                 <w:sz w:val="17"/>
               </w:rPr>
-              <w:t xml:space="preserve">Análisis de </w:t>
-            </w:r>
-            <w:r>
-              <w:rPr>
-                <w:color w:val="000000"/>
-                <w:sz w:val="17"/>
-              </w:rPr>
-              <w:t>brechas con ≥ 10 brechas, su tipo, esfuerzo y dependencias</w:t>
+              <w:t>Análisis de brechas con ≥ 10 brechas, su tipo, esfuerzo y dependencias</w:t>
             </w:r>
           </w:p>
         </w:tc>
@@ -9969,14 +9234,7 @@
                 <w:color w:val="000000"/>
                 <w:sz w:val="17"/>
               </w:rPr>
-              <w:t>Secuencia en 3 fases en https://</w:t>
-            </w:r>
-            <w:r>
-              <w:rPr>
-                <w:color w:val="000000"/>
-                <w:sz w:val="17"/>
-              </w:rPr>
-              <w:t>github.com/GianfrancoArocutipa/Taller10_Empresa_01_Exportadora/tree/taller-10/docs/evidencias/S10/salidas/salida_brechas.txt</w:t>
+              <w:t>Secuencia en 3 fases en https://github.com/GianfrancoArocutipa/Taller10_Empresa_01_Exportadora/tree/taller-10/docs/evidencias/S10/salidas/salida_brechas.txt</w:t>
             </w:r>
           </w:p>
         </w:tc>
@@ -10150,14 +9408,7 @@
                 <w:color w:val="000000"/>
                 <w:sz w:val="17"/>
               </w:rPr>
-              <w:t>Tags v0.10 y taller-10 en https://github.com/GianfrancoArocutipa/Taller10_Empr</w:t>
-            </w:r>
-            <w:r>
-              <w:rPr>
-                <w:color w:val="000000"/>
-                <w:sz w:val="17"/>
-              </w:rPr>
-              <w:t>esa_01_Exportadora/tree/taller-10</w:t>
+              <w:t>Tags v0.10 y taller-10 en https://github.com/GianfrancoArocutipa/Taller10_Empresa_01_Exportadora/tree/taller-10</w:t>
             </w:r>
           </w:p>
         </w:tc>
@@ -10179,13 +9430,7 @@
         <w:rPr>
           <w:color w:val="000000"/>
         </w:rPr>
-        <w:t>Evaluación global de resultados: Los trece resultados exigidos por la lista de comprobación de la Semana 10 fueron alcanzados satisfactoriamente (100% de cumplimiento). Toda la evidencia cuantitativa, d</w:t>
-      </w:r>
-      <w:r>
-        <w:rPr>
-          <w:color w:val="000000"/>
-        </w:rPr>
-        <w:t>atasets, diagramas a 300 DPI y scripts de cálculo se encuentran debidamente versionados y accesibles en el repositorio oficial de GitHub bajo la etiqueta 'taller-10'.</w:t>
+        <w:t>Evaluación global de resultados: Los trece resultados exigidos por la lista de comprobación de la Semana 10 fueron alcanzados satisfactoriamente (100% de cumplimiento). Toda la evidencia cuantitativa, datasets, diagramas a 300 DPI y scripts de cálculo se encuentran debidamente versionados y accesibles en el repositorio oficial de GitHub bajo la etiqueta 'taller-10'.</w:t>
       </w:r>
     </w:p>
     <w:p>
@@ -10193,11 +9438,11 @@
         <w:pStyle w:val="Ttulo1"/>
         <w:spacing w:after="120"/>
       </w:pPr>
-      <w:bookmarkStart w:id="19" w:name="_Toc242980127"/>
+      <w:bookmarkStart w:id="18" w:name="_Toc242980546"/>
       <w:r>
         <w:t>4. Conclusiones</w:t>
       </w:r>
-      <w:bookmarkEnd w:id="19"/>
+      <w:bookmarkEnd w:id="18"/>
     </w:p>
     <w:p>
       <w:pPr>
@@ -10209,26 +9454,13 @@
           <w:b/>
           <w:color w:val="000000"/>
         </w:rPr>
-        <w:t>1. La capa de datos revela la verdadera deuda técnica y el riesgo operaci</w:t>
-      </w:r>
-      <w:r>
-        <w:rPr>
-          <w:b/>
-          <w:color w:val="000000"/>
-        </w:rPr>
-        <w:t>onal de la empresa:</w:t>
-      </w:r>
-      <w:r>
-        <w:rPr>
-          <w:color w:val="000000"/>
-        </w:rPr>
-        <w:t xml:space="preserve"> El diagnóstico demostró que la dispersión del dato maestro de 'Lote' en cuatro sistemas y la falta de dueño formal (5 de 7 entidades sin dueño) explican por qué la empresa tardó 11 días en atender un reclamo de calidad en 2024. Los prob</w:t>
-      </w:r>
-      <w:r>
-        <w:rPr>
-          <w:color w:val="000000"/>
-        </w:rPr>
-        <w:t>lemas de trazabilidad no eran atribuibles al software de balanza, sino a la inexistencia de una fuente autoritativa de verdad. Preguntar quién responde por el lote reveló que múltiples áreas lo alimentan y ninguna responde por su consistencia.</w:t>
+        <w:t>1. La capa de datos revela la verdadera deuda técnica y el riesgo operacional de la empresa:</w:t>
+      </w:r>
+      <w:r>
+        <w:rPr>
+          <w:color w:val="000000"/>
+        </w:rPr>
+        <w:t xml:space="preserve"> El diagnóstico demostró que la dispersión del dato maestro de 'Lote' en cuatro sistemas y la falta de dueño formal (5 de 7 entidades sin dueño) explican por qué la empresa tardó 11 días en atender un reclamo de calidad en 2024. Los problemas de trazabilidad no eran atribuibles al software de balanza, sino a la inexistencia de una fuente autoritativa de verdad. Preguntar quién responde por el lote reveló que múltiples áreas lo alimentan y ninguna responde por su consistencia.</w:t>
       </w:r>
     </w:p>
     <w:p>
@@ -10241,26 +9473,13 @@
           <w:b/>
           <w:color w:val="000000"/>
         </w:rPr>
-        <w:t>2. La arquit</w:t>
-      </w:r>
-      <w:r>
-        <w:rPr>
-          <w:b/>
-          <w:color w:val="000000"/>
-        </w:rPr>
-        <w:t>ectura objetivo no se diseña por moda tecnológica, sino por estricta derivación estratégica:</w:t>
-      </w:r>
-      <w:r>
-        <w:rPr>
-          <w:color w:val="000000"/>
-        </w:rPr>
-        <w:t xml:space="preserve"> Cada componente propuesto en el modelo To-Be (el Módulo MES, las APIs de integración y la nube híbrida) responde a una métrica concreta del plan: reducir el tiempo</w:t>
-      </w:r>
-      <w:r>
-        <w:rPr>
-          <w:color w:val="000000"/>
-        </w:rPr>
-        <w:t xml:space="preserve"> de trazabilidad de 11 días a menos de 2 horas para cumplir las auditorías de SENASA y la Unión Europea. La trazabilidad bipolar entre el estado actual y el objetivo es lo que permite defender técnicamente el presupuesto de TI ante la Alta Dirección.</w:t>
+        <w:t>2. La arquitectura objetivo no se diseña por moda tecnológica, sino por estricta derivación estratégica:</w:t>
+      </w:r>
+      <w:r>
+        <w:rPr>
+          <w:color w:val="000000"/>
+        </w:rPr>
+        <w:t xml:space="preserve"> Cada componente propuesto en el modelo To-Be (el Módulo MES, las APIs de integración y la nube híbrida) responde a una métrica concreta del plan: reducir el tiempo de trazabilidad de 11 días a menos de 2 horas para cumplir las auditorías de SENASA y la Unión Europea. La trazabilidad bipolar entre el estado actual y el objetivo es lo que permite defender técnicamente el presupuesto de TI ante la Alta Dirección.</w:t>
       </w:r>
     </w:p>
     <w:p>
@@ -10273,32 +9492,13 @@
           <w:b/>
           <w:color w:val="000000"/>
         </w:rPr>
-        <w:t>3. La</w:t>
-      </w:r>
-      <w:r>
-        <w:rPr>
-          <w:b/>
-          <w:color w:val="000000"/>
-        </w:rPr>
-        <w:t>s dependencias entre paquetes de trabajo imponen una secuencia obligada que la hoja de ruta debe respetar:</w:t>
-      </w:r>
-      <w:r>
-        <w:rPr>
-          <w:color w:val="000000"/>
-        </w:rPr>
-        <w:t xml:space="preserve"> La ejecución del análisis de brechas demostró que proyectos como la analítica avanzada de costos o el portal de trazabilidad no pueden implementarse </w:t>
-      </w:r>
-      <w:r>
-        <w:rPr>
-          <w:color w:val="000000"/>
-        </w:rPr>
-        <w:t>sobre datos inconsistentes o infraestructura inestable. El Gobierno del Dato Maestro (PT-01) y la Infraestructura con Respaldo Inmutable (PT-04) constituyen prerrequisitos habilitadores ineludibles. Ignorar esta secuencia provocaría la parálisis de los sis</w:t>
-      </w:r>
-      <w:r>
-        <w:rPr>
-          <w:color w:val="000000"/>
-        </w:rPr>
-        <w:t>temas y el rechazo de los usuarios.</w:t>
+        <w:t>3. Las dependencias entre paquetes de trabajo imponen una secuencia obligada que la hoja de ruta debe respetar:</w:t>
+      </w:r>
+      <w:r>
+        <w:rPr>
+          <w:color w:val="000000"/>
+        </w:rPr>
+        <w:t xml:space="preserve"> La ejecución del análisis de brechas demostró que proyectos como la analítica avanzada de costos o el portal de trazabilidad no pueden implementarse sobre datos inconsistentes o infraestructura inestable. El Gobierno del Dato Maestro (PT-01) y la Infraestructura con Respaldo Inmutable (PT-04) constituyen prerrequisitos habilitadores ineludibles. Ignorar esta secuencia provocaría la parálisis de los sistemas y el rechazo de los usuarios.</w:t>
       </w:r>
     </w:p>
     <w:p>
@@ -10306,12 +9506,12 @@
         <w:pStyle w:val="Ttulo1"/>
         <w:spacing w:after="120"/>
       </w:pPr>
-      <w:bookmarkStart w:id="20" w:name="_Toc242980128"/>
+      <w:bookmarkStart w:id="19" w:name="_Toc242980547"/>
       <w:r>
         <w:lastRenderedPageBreak/>
         <w:t>5. Cuestionario</w:t>
       </w:r>
-      <w:bookmarkEnd w:id="20"/>
+      <w:bookmarkEnd w:id="19"/>
     </w:p>
     <w:p>
       <w:pPr>
@@ -10335,25 +9535,7 @@
         <w:rPr>
           <w:color w:val="000000"/>
         </w:rPr>
-        <w:t>Respuesta: Correría el rie</w:t>
-      </w:r>
-      <w:r>
-        <w:rPr>
-          <w:color w:val="000000"/>
-        </w:rPr>
-        <w:t>sgo inminente de parálisis operativa, pérdidas económicas millonarias por rechazo de exportaciones y sanciones regulatorias severas. En una agroexportadora como Valle Viejo, omitir la arquitectura empresarial implicaría seguir confiando el núcleo de la tra</w:t>
-      </w:r>
-      <w:r>
-        <w:rPr>
-          <w:color w:val="000000"/>
-        </w:rPr>
-        <w:t>zabilidad a un aplicativo artesanal en Access y libros de Excel manipulables. Si SENASA o la FDA auditan un embarque y la empresa tarda 11 días en reconstruir el lote (en lugar de 2 horas), los contenedores son retenidos en puerto perdiéndose perecibles de</w:t>
-      </w:r>
-      <w:r>
-        <w:rPr>
-          <w:color w:val="000000"/>
-        </w:rPr>
-        <w:t xml:space="preserve"> alto valor y cancelándose certificaciones internacionales. Asimismo, comprar un nuevo software sin sanear las entidades de datos duplicaría los costos de implantación sin resolver el desvío de kilos entre sistemas.</w:t>
+        <w:t>Respuesta: Correría el riesgo inminente de parálisis operativa, pérdidas económicas millonarias por rechazo de exportaciones y sanciones regulatorias severas. En una agroexportadora como Valle Viejo, omitir la arquitectura empresarial implicaría seguir confiando el núcleo de la trazabilidad a un aplicativo artesanal en Access y libros de Excel manipulables. Si SENASA o la FDA auditan un embarque y la empresa tarda 11 días en reconstruir el lote (en lugar de 2 horas), los contenedores son retenidos en puerto perdiéndose perecibles de alto valor y cancelándose certificaciones internacionales. Asimismo, comprar un nuevo software sin sanear las entidades de datos duplicaría los costos de implantación sin resolver el desvío de kilos entre sistemas.</w:t>
       </w:r>
     </w:p>
     <w:p>
@@ -10366,14 +9548,7 @@
           <w:b/>
           <w:color w:val="000000"/>
         </w:rPr>
-        <w:t>Pregunta 2: ¿Por qué es obligatorio mode</w:t>
-      </w:r>
-      <w:r>
-        <w:rPr>
-          <w:b/>
-          <w:color w:val="000000"/>
-        </w:rPr>
-        <w:t>lar las hojas de cálculo operativas dentro de la capa de aplicaciones de ArchiMate y qué impacto tiene omitirlas?</w:t>
+        <w:t>Pregunta 2: ¿Por qué es obligatorio modelar las hojas de cálculo operativas dentro de la capa de aplicaciones de ArchiMate y qué impacto tiene omitirlas?</w:t>
       </w:r>
     </w:p>
     <w:p>
@@ -10385,19 +9560,7 @@
         <w:rPr>
           <w:color w:val="000000"/>
         </w:rPr>
-        <w:t>Respuesta: Porque en organizaciones medianas, las hojas de cálculo operan en la práctica como sistemas de información críticos (Shadow IT). Si</w:t>
-      </w:r>
-      <w:r>
-        <w:rPr>
-          <w:color w:val="000000"/>
-        </w:rPr>
-        <w:t xml:space="preserve"> se omitieran del modelo para reflejar solo los sistemas formalmente adquiridos, se construiría una arquitectura ficticia. Omitir el libro de Excel de trazabilidad o el de costos de Finanzas impediría detectar las brechas de integración reales, llevando a </w:t>
-      </w:r>
-      <w:r>
-        <w:rPr>
-          <w:color w:val="000000"/>
-        </w:rPr>
-        <w:t>formular proyectos de TI que no resuelven el trabajo manual subyacente y perpetúan la duplicidad de digitación.</w:t>
+        <w:t>Respuesta: Porque en organizaciones medianas, las hojas de cálculo operan en la práctica como sistemas de información críticos (Shadow IT). Si se omitieran del modelo para reflejar solo los sistemas formalmente adquiridos, se construiría una arquitectura ficticia. Omitir el libro de Excel de trazabilidad o el de costos de Finanzas impediría detectar las brechas de integración reales, llevando a formular proyectos de TI que no resuelven el trabajo manual subyacente y perpetúan la duplicidad de digitación.</w:t>
       </w:r>
     </w:p>
     <w:p>
@@ -10410,14 +9573,7 @@
           <w:b/>
           <w:color w:val="000000"/>
         </w:rPr>
-        <w:t xml:space="preserve">Pregunta 3: ¿Por qué se afirma en el marco TOGAF que la capa de datos es la que mayor valor aporta al PETI y la que menos suele estar </w:t>
-      </w:r>
-      <w:r>
-        <w:rPr>
-          <w:b/>
-          <w:color w:val="000000"/>
-        </w:rPr>
-        <w:t>documentada?</w:t>
+        <w:t>Pregunta 3: ¿Por qué se afirma en el marco TOGAF que la capa de datos es la que mayor valor aporta al PETI y la que menos suele estar documentada?</w:t>
       </w:r>
     </w:p>
     <w:p>
@@ -10429,13 +9585,7 @@
         <w:rPr>
           <w:color w:val="000000"/>
         </w:rPr>
-        <w:t>Respuesta: Porque los datos representan los activos informacionales perdurables del negocio, independientes de la tecnología de turno. La tecnología cambia de servidor a nube y las aplicaciones se reemplazan, pero el histórico de lotes, client</w:t>
-      </w:r>
-      <w:r>
-        <w:rPr>
-          <w:color w:val="000000"/>
-        </w:rPr>
-        <w:t>es y compras permanece. Documentar la capa de datos revela las inconsistencias estructurales que ninguna herramienta automática detecta: duplicidades de registros, ausencia de fuentes autoritativas y vacío de responsabilidades legales.</w:t>
+        <w:t>Respuesta: Porque los datos representan los activos informacionales perdurables del negocio, independientes de la tecnología de turno. La tecnología cambia de servidor a nube y las aplicaciones se reemplazan, pero el histórico de lotes, clientes y compras permanece. Documentar la capa de datos revela las inconsistencias estructurales que ninguna herramienta automática detecta: duplicidades de registros, ausencia de fuentes autoritativas y vacío de responsabilidades legales.</w:t>
       </w:r>
     </w:p>
     <w:p>
@@ -10448,14 +9598,7 @@
           <w:b/>
           <w:color w:val="000000"/>
         </w:rPr>
-        <w:t>Pregunta 4: ¿Cómo ju</w:t>
-      </w:r>
-      <w:r>
-        <w:rPr>
-          <w:b/>
-          <w:color w:val="000000"/>
-        </w:rPr>
-        <w:t>stifica la regla de dependencias que el paquete de trabajo PT-01 (Gobierno del Dato) deba preceder a PT-02 (Trazabilidad MES) y PT-05 (Costeo Estándar)?</w:t>
+        <w:t>Pregunta 4: ¿Cómo justifica la regla de dependencias que el paquete de trabajo PT-01 (Gobierno del Dato) deba preceder a PT-02 (Trazabilidad MES) y PT-05 (Costeo Estándar)?</w:t>
       </w:r>
     </w:p>
     <w:p>
@@ -10467,19 +9610,7 @@
         <w:rPr>
           <w:color w:val="000000"/>
         </w:rPr>
-        <w:t xml:space="preserve">Respuesta: Porque un sistema transaccional o de costeo solo es tan confiable como los datos maestros </w:t>
-      </w:r>
-      <w:r>
-        <w:rPr>
-          <w:color w:val="000000"/>
-        </w:rPr>
-        <w:t>que consume. Si se implementa un software de trazabilidad industrial o de costeo automático antes de definir la estructura única del lote y sanear el padrón de productores agrícolas, el nuevo sistema procesará registros inconsistentes, arrojando mermas fic</w:t>
-      </w:r>
-      <w:r>
-        <w:rPr>
-          <w:color w:val="000000"/>
-        </w:rPr>
-        <w:t>ticias y liquidaciones erróneas. El principio 'basura entra, basura sale' impone que el gobierno del dato sea siempre el primer hito habilitador.</w:t>
+        <w:t>Respuesta: Porque un sistema transaccional o de costeo solo es tan confiable como los datos maestros que consume. Si se implementa un software de trazabilidad industrial o de costeo automático antes de definir la estructura única del lote y sanear el padrón de productores agrícolas, el nuevo sistema procesará registros inconsistentes, arrojando mermas ficticias y liquidaciones erróneas. El principio 'basura entra, basura sale' impone que el gobierno del dato sea siempre el primer hito habilitador.</w:t>
       </w:r>
     </w:p>
     <w:p>
@@ -10487,11 +9618,11 @@
         <w:pStyle w:val="Ttulo1"/>
         <w:spacing w:after="120"/>
       </w:pPr>
-      <w:bookmarkStart w:id="21" w:name="_Toc242980129"/>
+      <w:bookmarkStart w:id="20" w:name="_Toc242980548"/>
       <w:r>
         <w:t>6. Referencias bibliográficas</w:t>
       </w:r>
-      <w:bookmarkEnd w:id="21"/>
+      <w:bookmarkEnd w:id="20"/>
     </w:p>
     <w:p>
       <w:pPr>
@@ -10504,14 +9635,7 @@
           <w:color w:val="000000"/>
           <w:sz w:val="19"/>
         </w:rPr>
-        <w:t>Archi. (2024). Archi — Open Source ArchiMate Modelling (Versión 5.4). https://ww</w:t>
-      </w:r>
-      <w:r>
-        <w:rPr>
-          <w:color w:val="000000"/>
-          <w:sz w:val="19"/>
-        </w:rPr>
-        <w:t>w.archimatetool.com/</w:t>
+        <w:t>Archi. (2024). Archi — Open Source ArchiMate Modelling (Versión 5.4). https://www.archimatetool.com/</w:t>
       </w:r>
     </w:p>
     <w:p>
@@ -10540,14 +9664,7 @@
           <w:sz w:val="19"/>
         </w:rPr>
         <w:lastRenderedPageBreak/>
-        <w:t>ISACA. (2018). COBIT 2019 Framework: Governance and Management Objectives (Objetivos APO</w:t>
-      </w:r>
-      <w:r>
-        <w:rPr>
-          <w:color w:val="000000"/>
-          <w:sz w:val="19"/>
-        </w:rPr>
-        <w:t>03 Managed Enterprise Architecture y DSS04 Managed Continuity). Information Systems Audit and Control Association.</w:t>
+        <w:t>ISACA. (2018). COBIT 2019 Framework: Governance and Management Objectives (Objetivos APO03 Managed Enterprise Architecture y DSS04 Managed Continuity). Information Systems Audit and Control Association.</w:t>
       </w:r>
     </w:p>
     <w:p>
@@ -10575,14 +9692,7 @@
           <w:color w:val="000000"/>
           <w:sz w:val="19"/>
         </w:rPr>
-        <w:t>Lankhorst, M. (20</w:t>
-      </w:r>
-      <w:r>
-        <w:rPr>
-          <w:color w:val="000000"/>
-          <w:sz w:val="19"/>
-        </w:rPr>
-        <w:t>17). Enterprise Architecture at Work: Modelling, Communication and Analysis (4.ª ed.). Springer.</w:t>
+        <w:t>Lankhorst, M. (2017). Enterprise Architecture at Work: Modelling, Communication and Analysis (4.ª ed.). Springer.</w:t>
       </w:r>
     </w:p>
     <w:p>
@@ -10596,14 +9706,7 @@
           <w:color w:val="000000"/>
           <w:sz w:val="19"/>
         </w:rPr>
-        <w:t xml:space="preserve">MINTIC Colombia. (2020). Marco de Referencia de Arquitectura Empresarial para la gestión de TI en el Estado. Ministerio de Tecnologías de la Información y las </w:t>
-      </w:r>
-      <w:r>
-        <w:rPr>
-          <w:color w:val="000000"/>
-          <w:sz w:val="19"/>
-        </w:rPr>
-        <w:t>Comunicaciones.</w:t>
+        <w:t>MINTIC Colombia. (2020). Marco de Referencia de Arquitectura Empresarial para la gestión de TI en el Estado. Ministerio de Tecnologías de la Información y las Comunicaciones.</w:t>
       </w:r>
     </w:p>
     <w:p>
@@ -10631,14 +9734,7 @@
           <w:color w:val="000000"/>
           <w:sz w:val="19"/>
         </w:rPr>
-        <w:t>Rodríguez Bermúdez, J. R. (2015). Planificación y direcció</w:t>
-      </w:r>
-      <w:r>
-        <w:rPr>
-          <w:color w:val="000000"/>
-          <w:sz w:val="19"/>
-        </w:rPr>
-        <w:t>n estratégica de sistemas de información. Editorial UOC.</w:t>
+        <w:t>Rodríguez Bermúdez, J. R. (2015). Planificación y dirección estratégica de sistemas de información. Editorial UOC.</w:t>
       </w:r>
     </w:p>
     <w:p>
@@ -10666,14 +9762,7 @@
           <w:color w:val="000000"/>
           <w:sz w:val="19"/>
         </w:rPr>
-        <w:t>SENASA. (2023). Manual de Procedimi</w:t>
-      </w:r>
-      <w:r>
-        <w:rPr>
-          <w:color w:val="000000"/>
-          <w:sz w:val="19"/>
-        </w:rPr>
-        <w:t>entos para la Certificación Fitosanitaria de Exportación de Productos Agrícolas. Servicio Nacional de Sanidad Agraria del Perú.</w:t>
+        <w:t>SENASA. (2023). Manual de Procedimientos para la Certificación Fitosanitaria de Exportación de Productos Agrícolas. Servicio Nacional de Sanidad Agraria del Perú.</w:t>
       </w:r>
     </w:p>
     <w:p>
@@ -10701,14 +9790,7 @@
           <w:color w:val="000000"/>
           <w:sz w:val="19"/>
         </w:rPr>
-        <w:t>The Open Group. (2022</w:t>
-      </w:r>
-      <w:r>
-        <w:rPr>
-          <w:color w:val="000000"/>
-          <w:sz w:val="19"/>
-        </w:rPr>
-        <w:t>). ArchiMate® 3.2 Specification. The Open Group. https://pubs.opengroup.org/architecture/archimate3-doc/</w:t>
+        <w:t>The Open Group. (2022). ArchiMate® 3.2 Specification. The Open Group. https://pubs.opengroup.org/architecture/archimate3-doc/</w:t>
       </w:r>
     </w:p>
     <w:p>
@@ -10716,11 +9798,11 @@
         <w:pStyle w:val="Ttulo1"/>
         <w:spacing w:after="120"/>
       </w:pPr>
-      <w:bookmarkStart w:id="22" w:name="_Toc242980130"/>
+      <w:bookmarkStart w:id="21" w:name="_Toc242980549"/>
       <w:r>
         <w:t>7. Anexos</w:t>
       </w:r>
-      <w:bookmarkEnd w:id="22"/>
+      <w:bookmarkEnd w:id="21"/>
     </w:p>
     <w:p>
       <w:pPr>
@@ -10746,35 +9828,21 @@
           <w:color w:val="003399"/>
           <w:sz w:val="19"/>
         </w:rPr>
-        <w:t>Archivo: anexos/anexo_A_modelo_arquitectura.archimate | Enlace oficial: https://gi</w:t>
+        <w:t>Archivo: anexos/anexo_A_modelo_arquitectura.archimate | Enlace oficial: https://github.com/GianfrancoArocutipa/Taller10_Empresa_01_Exportadora/tree/taller-10/anexos/anexo_A_modelo_arquitectura.archimate</w:t>
       </w:r>
       <w:r>
         <w:rPr>
           <w:color w:val="003399"/>
           <w:sz w:val="19"/>
         </w:rPr>
-        <w:t>thub.com/GianfrancoArocutipa/Taller10_Empresa_01_Exportadora/tree/taller-10/anexos/anexo_A_modelo_arquitectura.archimate</w:t>
-      </w:r>
-      <w:r>
-        <w:rPr>
-          <w:color w:val="003399"/>
+        <w:br/>
+      </w:r>
+      <w:r>
+        <w:rPr>
+          <w:color w:val="000000"/>
           <w:sz w:val="19"/>
         </w:rPr>
-        <w:br/>
-      </w:r>
-      <w:r>
-        <w:rPr>
-          <w:color w:val="000000"/>
-          <w:sz w:val="19"/>
-        </w:rPr>
-        <w:t>Descripción: Archivo oficial en formato XML nativo de Archi con la especificación completa de elementos de Negocio, Aplicación, Tecnolo</w:t>
-      </w:r>
-      <w:r>
-        <w:rPr>
-          <w:color w:val="000000"/>
-          <w:sz w:val="19"/>
-        </w:rPr>
-        <w:t>gía y Motivación.</w:t>
+        <w:t>Descripción: Archivo oficial en formato XML nativo de Archi con la especificación completa de elementos de Negocio, Aplicación, Tecnología y Motivación.</w:t>
       </w:r>
     </w:p>
     <w:p>
@@ -10801,14 +9869,7 @@
           <w:color w:val="003399"/>
           <w:sz w:val="19"/>
         </w:rPr>
-        <w:t>Archivo: anexos/anexo_B_vista_proceso_aplicacion.png | Enlace oficial: https://github.com/GianfrancoArocutipa/Taller10_Empresa_01_Exportadora/tree/taller-10/anexos/anexo_B_vista_proceso_a</w:t>
-      </w:r>
-      <w:r>
-        <w:rPr>
-          <w:color w:val="003399"/>
-          <w:sz w:val="19"/>
-        </w:rPr>
-        <w:t>plicacion.png</w:t>
+        <w:t>Archivo: anexos/anexo_B_vista_proceso_aplicacion.png | Enlace oficial: https://github.com/GianfrancoArocutipa/Taller10_Empresa_01_Exportadora/tree/taller-10/anexos/anexo_B_vista_proceso_aplicacion.png</w:t>
       </w:r>
       <w:r>
         <w:rPr>
@@ -10849,35 +9910,21 @@
           <w:color w:val="003399"/>
           <w:sz w:val="19"/>
         </w:rPr>
-        <w:t>Archivo: anexos/anexo_C_estructura_info</w:t>
+        <w:t>Archivo: anexos/anexo_C_estructura_informacion.xlsx | Enlace oficial: https://github.com/GianfrancoArocutipa/Taller10_Empresa_01_Exportadora/tree/taller-10/anexos/anexo_C_estructura_informacion.xlsx</w:t>
       </w:r>
       <w:r>
         <w:rPr>
           <w:color w:val="003399"/>
           <w:sz w:val="19"/>
         </w:rPr>
-        <w:t>rmacion.xlsx | Enlace oficial: https://github.com/GianfrancoArocutipa/Taller10_Empresa_01_Exportadora/tree/taller-10/anexos/anexo_C_estructura_informacion.xlsx</w:t>
-      </w:r>
-      <w:r>
-        <w:rPr>
-          <w:color w:val="003399"/>
+        <w:br/>
+      </w:r>
+      <w:r>
+        <w:rPr>
+          <w:color w:val="000000"/>
           <w:sz w:val="19"/>
         </w:rPr>
-        <w:br/>
-      </w:r>
-      <w:r>
-        <w:rPr>
-          <w:color w:val="000000"/>
-          <w:sz w:val="19"/>
-        </w:rPr>
-        <w:t>Descripción: Libro de cálculo en Excel con el inventario de entidades de datos, sistemas de resi</w:t>
-      </w:r>
-      <w:r>
-        <w:rPr>
-          <w:color w:val="000000"/>
-          <w:sz w:val="19"/>
-        </w:rPr>
-        <w:t>dencia, discrepancias observadas, conteos y asignación de dueños por cargo.</w:t>
+        <w:t>Descripción: Libro de cálculo en Excel con el inventario de entidades de datos, sistemas de residencia, discrepancias observadas, conteos y asignación de dueños por cargo.</w:t>
       </w:r>
     </w:p>
     <w:p>
@@ -10904,35 +9951,21 @@
           <w:color w:val="003399"/>
           <w:sz w:val="19"/>
         </w:rPr>
-        <w:t xml:space="preserve">Archivo: anexos/anexo_D_arquitectura_objetivo.png | Enlace oficial: </w:t>
+        <w:t>Archivo: anexos/anexo_D_arquitectura_objetivo.png | Enlace oficial: https://github.com/GianfrancoArocutipa/Taller10_Empresa_01_Exportadora/tree/taller-10/anexos/anexo_D_arquitectura_objetivo.png</w:t>
       </w:r>
       <w:r>
         <w:rPr>
           <w:color w:val="003399"/>
           <w:sz w:val="19"/>
         </w:rPr>
-        <w:t>https://github.com/GianfrancoArocutipa/Taller10_Empresa_01_Exportadora/tree/taller-10/anexos/anexo_D_arquitectura_objetivo.png</w:t>
-      </w:r>
-      <w:r>
-        <w:rPr>
-          <w:color w:val="003399"/>
+        <w:br/>
+      </w:r>
+      <w:r>
+        <w:rPr>
+          <w:color w:val="000000"/>
           <w:sz w:val="19"/>
         </w:rPr>
-        <w:br/>
-      </w:r>
-      <w:r>
-        <w:rPr>
-          <w:color w:val="000000"/>
-          <w:sz w:val="19"/>
-        </w:rPr>
-        <w:t xml:space="preserve">Descripción: Diagrama en alta resolución que muestra la modernización de las tres capas con el módulo MES, APIs de integración y </w:t>
-      </w:r>
-      <w:r>
-        <w:rPr>
-          <w:color w:val="000000"/>
-          <w:sz w:val="19"/>
-        </w:rPr>
-        <w:t>nube híbrida.</w:t>
+        <w:t>Descripción: Diagrama en alta resolución que muestra la modernización de las tres capas con el módulo MES, APIs de integración y nube híbrida.</w:t>
       </w:r>
     </w:p>
     <w:p>
@@ -10959,14 +9992,7 @@
           <w:color w:val="003399"/>
           <w:sz w:val="19"/>
         </w:rPr>
-        <w:t>Archivo: anexos/anexo_E_analisis_brechas.xlsx | Enlace oficial: https://github.com/GianfrancoArocutipa/Taller10_Empresa_01_Exportadora/tree/taller-10/anexos/anexo_E_analisis_brech</w:t>
-      </w:r>
-      <w:r>
-        <w:rPr>
-          <w:color w:val="003399"/>
-          <w:sz w:val="19"/>
-        </w:rPr>
-        <w:t>as.xlsx</w:t>
+        <w:t>Archivo: anexos/anexo_E_analisis_brechas.xlsx | Enlace oficial: https://github.com/GianfrancoArocutipa/Taller10_Empresa_01_Exportadora/tree/taller-10/anexos/anexo_E_analisis_brechas.xlsx</w:t>
       </w:r>
       <w:r>
         <w:rPr>
@@ -11008,35 +10034,21 @@
           <w:color w:val="003399"/>
           <w:sz w:val="19"/>
         </w:rPr>
-        <w:t>Archivo: docs/05_seccion_arquitectura.md |</w:t>
+        <w:t>Archivo: docs/05_seccion_arquitectura.md | Enlace oficial: https://github.com/GianfrancoArocutipa/Taller10_Empresa_01_Exportadora/tree/taller-10/docs/05_seccion_arquitectura.md</w:t>
       </w:r>
       <w:r>
         <w:rPr>
           <w:color w:val="003399"/>
           <w:sz w:val="19"/>
         </w:rPr>
-        <w:t xml:space="preserve"> Enlace oficial: https://github.com/GianfrancoArocutipa/Taller10_Empresa_01_Exportadora/tree/taller-10/docs/05_seccion_arquitectura.md</w:t>
-      </w:r>
-      <w:r>
-        <w:rPr>
-          <w:color w:val="003399"/>
+        <w:br/>
+      </w:r>
+      <w:r>
+        <w:rPr>
+          <w:color w:val="000000"/>
           <w:sz w:val="19"/>
         </w:rPr>
-        <w:br/>
-      </w:r>
-      <w:r>
-        <w:rPr>
-          <w:color w:val="000000"/>
-          <w:sz w:val="19"/>
-        </w:rPr>
-        <w:t>Descripción: Documento normativo final redactado formalmente e incorporado al Plan Estratégico de TI bajo la versión v0.1</w:t>
-      </w:r>
-      <w:r>
-        <w:rPr>
-          <w:color w:val="000000"/>
-          <w:sz w:val="19"/>
-        </w:rPr>
-        <w:t>0.</w:t>
+        <w:t>Descripción: Documento normativo final redactado formalmente e incorporado al Plan Estratégico de TI bajo la versión v0.10.</w:t>
       </w:r>
     </w:p>
     <w:sectPr>
@@ -11175,7 +10187,7 @@
         <w:noProof/>
       </w:rPr>
       <w:drawing>
-        <wp:inline distT="0" distB="0" distL="0" distR="0" wp14:anchorId="53A85786" wp14:editId="7C3290A2">
+        <wp:inline distT="0" distB="0" distL="0" distR="0" wp14:anchorId="29AB45CA" wp14:editId="2AA1256F">
           <wp:extent cx="502920" cy="502920"/>
           <wp:effectExtent l="0" t="0" r="0" b="0"/>
           <wp:docPr id="1" name="Imagen 1" descr="Logotipo de la Universidad Privada de Tacna"/>
@@ -11463,7 +10475,7 @@
         <w:rFonts w:ascii="Arial" w:eastAsia="Arial" w:hAnsi="Arial" w:cs="Arial"/>
         <w:sz w:val="22"/>
         <w:szCs w:val="22"/>
-        <w:lang w:eastAsia="en-US" w:bidi="ar-SA"/>
+        <w:lang w:val="es-PE" w:eastAsia="en-US" w:bidi="ar-SA"/>
       </w:rPr>
     </w:rPrDefault>
     <w:pPrDefault>

</xml_diff>